<commit_message>
build(dist): rebuild all docx+PDF after format + hypothesis updates
Regenerates 20 docx + 20 PDF in dist/downloads/ and refreshes the CTU
docx in dist/chuyen_de_1/ and dist/luan_an_ctu/ with the new markdown
pipeline (en-dash→hyphen, restructured H1-H6, native equations). 0 errors,
0 missing glyphs.

https://claude.ai/code/session_01TqgqRfCDLY39798jcQXCr9
</commit_message>
<xml_diff>
--- a/dist/downloads/04_references_apa7.docx
+++ b/dist/downloads/04_references_apa7.docx
@@ -28,7 +28,7 @@
         <w:t xml:space="preserve">00</w:t>
       </w:r>
       <w:r>
-        <w:t xml:space="preserve">–</w:t>
+        <w:t xml:space="preserve">-</w:t>
       </w:r>
       <w:r>
         <w:rPr>
@@ -558,7 +558,7 @@
           <w:bCs/>
           <w:b/>
         </w:rPr>
-        <w:t xml:space="preserve">(6), 537–543.</w:t>
+        <w:t xml:space="preserve">(6), 537-543.</w:t>
       </w:r>
       <w:r>
         <w:t xml:space="preserve"> </w:t>
@@ -609,7 +609,7 @@
           <w:bCs/>
           <w:b/>
         </w:rPr>
-        <w:t xml:space="preserve">(1), 1–31.</w:t>
+        <w:t xml:space="preserve">(1), 1-31.</w:t>
       </w:r>
       <w:r>
         <w:t xml:space="preserve"> </w:t>
@@ -660,7 +660,7 @@
           <w:bCs/>
           <w:b/>
         </w:rPr>
-        <w:t xml:space="preserve">(5), 535–551.</w:t>
+        <w:t xml:space="preserve">(5), 535-551.</w:t>
       </w:r>
       <w:r>
         <w:t xml:space="preserve"> </w:t>
@@ -711,7 +711,7 @@
           <w:bCs/>
           <w:b/>
         </w:rPr>
-        <w:t xml:space="preserve">(3), 595–613.</w:t>
+        <w:t xml:space="preserve">(3), 595-613.</w:t>
       </w:r>
       <w:r>
         <w:t xml:space="preserve"> </w:t>
@@ -731,13 +731,13 @@
       </w:r>
     </w:p>
     <w:bookmarkEnd w:id="20"/>
-    <w:bookmarkStart w:id="21" w:name="X094bc8b13169a81669f6b7abcf887888d4186ca"/>
+    <w:bookmarkStart w:id="21" w:name="Xdddc3dd33816a0d15b1ee27292b4b9ce93f0ba7"/>
     <w:p>
       <w:pPr>
         <w:pStyle w:val="Heading2"/>
       </w:pPr>
       <w:r>
-        <w:t xml:space="preserve">B. Internationalization–Firm Performance: Foundational empirical</w:t>
+        <w:t xml:space="preserve">B. Internationalization-Firm Performance: Foundational empirical</w:t>
       </w:r>
     </w:p>
     <w:p>
@@ -764,13 +764,13 @@
       </w:r>
     </w:p>
     <w:bookmarkEnd w:id="21"/>
-    <w:bookmarkStart w:id="22" w:name="c.-meta-analyses-về-ip-relationship"/>
+    <w:bookmarkStart w:id="22" w:name="c.-meta-analyses-về-i-p-relationship"/>
     <w:p>
       <w:pPr>
         <w:pStyle w:val="Heading2"/>
       </w:pPr>
       <w:r>
-        <w:t xml:space="preserve">C. Meta-analyses về I–P relationship</w:t>
+        <w:t xml:space="preserve">C. Meta-analyses về I-P relationship</w:t>
       </w:r>
     </w:p>
     <w:p>
@@ -782,13 +782,13 @@
       </w:r>
     </w:p>
     <w:bookmarkEnd w:id="22"/>
-    <w:bookmarkStart w:id="23" w:name="Xb02f9563701139be84b359c2d25884190ee9110"/>
+    <w:bookmarkStart w:id="23" w:name="X9097ee1fea4d56edd2b99c3d71a4a615432cf1f"/>
     <w:p>
       <w:pPr>
         <w:pStyle w:val="Heading2"/>
       </w:pPr>
       <w:r>
-        <w:t xml:space="preserve">D. Recent IB literature 2019–2025 (cập nhật v2.3 — bổ sung Xu 2024 GSJ + Kafouros 2023 GSJ)</w:t>
+        <w:t xml:space="preserve">D. Recent IB literature 2019-2025 (cập nhật v2.3 — bổ sung Xu 2024 GSJ + Kafouros 2023 GSJ)</w:t>
       </w:r>
     </w:p>
     <w:p>
@@ -809,7 +809,7 @@
         <w:t xml:space="preserve">Eurasian Business Review, 14</w:t>
       </w:r>
       <w:r>
-        <w:t xml:space="preserve">(4), 881–915.</w:t>
+        <w:t xml:space="preserve">(4), 881-915.</w:t>
       </w:r>
     </w:p>
     <w:p>
@@ -851,7 +851,7 @@
         <w:t xml:space="preserve">Journal of International Business Studies, 50</w:t>
       </w:r>
       <w:r>
-        <w:t xml:space="preserve">(8), 1372–1387.</w:t>
+        <w:t xml:space="preserve">(8), 1372-1387.</w:t>
       </w:r>
     </w:p>
     <w:p>
@@ -893,7 +893,7 @@
         <w:t xml:space="preserve">IEEE Transactions on Engineering Management, 71</w:t>
       </w:r>
       <w:r>
-        <w:t xml:space="preserve">, 1–14.</w:t>
+        <w:t xml:space="preserve">, 1-14.</w:t>
       </w:r>
     </w:p>
     <w:p>
@@ -914,15 +914,15 @@
         <w:t xml:space="preserve">Managerial and Decision Economics, 43</w:t>
       </w:r>
       <w:r>
-        <w:t xml:space="preserve">(5), 1706–1720.</w:t>
-      </w:r>
-    </w:p>
-    <w:p>
-      <w:pPr>
-        <w:pStyle w:val="BodyText"/>
-      </w:pPr>
-      <w:r>
-        <w:t xml:space="preserve">Cuervo-Cazurra, A., Ciravegna, L., Melgarejo, M., &amp; Lopez, L. (2018). Home country uncertainty and the internationalization–performance relationship.</w:t>
+        <w:t xml:space="preserve">(5), 1706-1720.</w:t>
+      </w:r>
+    </w:p>
+    <w:p>
+      <w:pPr>
+        <w:pStyle w:val="BodyText"/>
+      </w:pPr>
+      <w:r>
+        <w:t xml:space="preserve">Cuervo-Cazurra, A., Ciravegna, L., Melgarejo, M., &amp; Lopez, L. (2018). Home country uncertainty and the internationalization-performance relationship.</w:t>
       </w:r>
       <w:r>
         <w:t xml:space="preserve"> </w:t>
@@ -935,7 +935,7 @@
         <w:t xml:space="preserve">Journal of World Business, 53</w:t>
       </w:r>
       <w:r>
-        <w:t xml:space="preserve">(2), 209–221.</w:t>
+        <w:t xml:space="preserve">(2), 209-221.</w:t>
       </w:r>
     </w:p>
     <w:p>
@@ -991,7 +991,7 @@
           <w:bCs/>
           <w:b/>
         </w:rPr>
-        <w:t xml:space="preserve">(1), 56–83.</w:t>
+        <w:t xml:space="preserve">(1), 56-83.</w:t>
       </w:r>
       <w:r>
         <w:t xml:space="preserve"> </w:t>
@@ -1015,7 +1015,7 @@
         <w:pStyle w:val="BodyText"/>
       </w:pPr>
       <w:r>
-        <w:t xml:space="preserve">Nath, P., Kirca, A. H., &amp; Kim, S. (2021). A study of the internationalization–performance relationship in global retailing.</w:t>
+        <w:t xml:space="preserve">Nath, P., Kirca, A. H., &amp; Kim, S. (2021). A study of the internationalization-performance relationship in global retailing.</w:t>
       </w:r>
       <w:r>
         <w:t xml:space="preserve"> </w:t>
@@ -1028,7 +1028,7 @@
         <w:t xml:space="preserve">Journal of International Marketing, 29</w:t>
       </w:r>
       <w:r>
-        <w:t xml:space="preserve">(1), 57–76.</w:t>
+        <w:t xml:space="preserve">(1), 57-76.</w:t>
       </w:r>
     </w:p>
     <w:p>
@@ -1049,7 +1049,7 @@
         <w:t xml:space="preserve">Global Strategy Journal, 11</w:t>
       </w:r>
       <w:r>
-        <w:t xml:space="preserve">(1), 58–80.</w:t>
+        <w:t xml:space="preserve">(1), 58-80.</w:t>
       </w:r>
     </w:p>
     <w:p>
@@ -1070,7 +1070,7 @@
         <w:t xml:space="preserve">Journal of Business Research, 122</w:t>
       </w:r>
       <w:r>
-        <w:t xml:space="preserve">, 889–901.</w:t>
+        <w:t xml:space="preserve">, 889-901.</w:t>
       </w:r>
     </w:p>
     <w:p>
@@ -1105,7 +1105,7 @@
           <w:bCs/>
           <w:b/>
         </w:rPr>
-        <w:t xml:space="preserve">(4), 754–799.</w:t>
+        <w:t xml:space="preserve">(4), 754-799.</w:t>
       </w:r>
       <w:r>
         <w:t xml:space="preserve"> </w:t>
@@ -1174,7 +1174,7 @@
           <w:bCs/>
           <w:b/>
         </w:rPr>
-        <w:t xml:space="preserve">(13), 2305–2341.</w:t>
+        <w:t xml:space="preserve">(13), 2305-2341.</w:t>
       </w:r>
       <w:r>
         <w:t xml:space="preserve"> </w:t>
@@ -1225,7 +1225,7 @@
           <w:bCs/>
           <w:b/>
         </w:rPr>
-        <w:t xml:space="preserve">(2), 1–17.</w:t>
+        <w:t xml:space="preserve">(2), 1-17.</w:t>
       </w:r>
       <w:r>
         <w:t xml:space="preserve"> </w:t>
@@ -1259,7 +1259,7 @@
         <w:pStyle w:val="FirstParagraph"/>
       </w:pPr>
       <w:r>
-        <w:t xml:space="preserve">Chen, S., &amp; Tan, H. (2012). Region effects in the internationalization–performance relationship in Chinese firms.</w:t>
+        <w:t xml:space="preserve">Chen, S., &amp; Tan, H. (2012). Region effects in the internationalization-performance relationship in Chinese firms.</w:t>
       </w:r>
       <w:r>
         <w:t xml:space="preserve"> </w:t>
@@ -1272,7 +1272,7 @@
         <w:t xml:space="preserve">Journal of World Business, 47</w:t>
       </w:r>
       <w:r>
-        <w:t xml:space="preserve">(1), 73–80.</w:t>
+        <w:t xml:space="preserve">(1), 73-80.</w:t>
       </w:r>
     </w:p>
     <w:p>
@@ -1293,7 +1293,7 @@
         <w:t xml:space="preserve">Emerging Markets Finance and Trade, 55</w:t>
       </w:r>
       <w:r>
-        <w:t xml:space="preserve">(7), 1455–1471.</w:t>
+        <w:t xml:space="preserve">(7), 1455-1471.</w:t>
       </w:r>
     </w:p>
     <w:p>
@@ -1377,7 +1377,7 @@
         <w:t xml:space="preserve">Journal of International Management, 19</w:t>
       </w:r>
       <w:r>
-        <w:t xml:space="preserve">(2), 118–137.</w:t>
+        <w:t xml:space="preserve">(2), 118-137.</w:t>
       </w:r>
     </w:p>
     <w:p>
@@ -1429,7 +1429,7 @@
         <w:t xml:space="preserve">International Journal of Emerging Markets, 17</w:t>
       </w:r>
       <w:r>
-        <w:t xml:space="preserve">(4), 1085–1106.</w:t>
+        <w:t xml:space="preserve">(4), 1085-1106.</w:t>
       </w:r>
     </w:p>
     <w:p>
@@ -1450,7 +1450,7 @@
         <w:t xml:space="preserve">Journal of Financial and Quantitative Analysis, 46</w:t>
       </w:r>
       <w:r>
-        <w:t xml:space="preserve">(6), 1545–1580.</w:t>
+        <w:t xml:space="preserve">(6), 1545-1580.</w:t>
       </w:r>
     </w:p>
     <w:p>
@@ -1543,7 +1543,7 @@
         <w:t xml:space="preserve">Strategic Management Journal, 22</w:t>
       </w:r>
       <w:r>
-        <w:t xml:space="preserve">(6–7), 565–586.</w:t>
+        <w:t xml:space="preserve">(6-7), 565-586.</w:t>
       </w:r>
     </w:p>
     <w:p>
@@ -1564,7 +1564,7 @@
         <w:t xml:space="preserve">Journal of Business Research, 138</w:t>
       </w:r>
       <w:r>
-        <w:t xml:space="preserve">, 280–294.</w:t>
+        <w:t xml:space="preserve">, 280-294.</w:t>
       </w:r>
     </w:p>
     <w:p>
@@ -1585,7 +1585,7 @@
         <w:t xml:space="preserve">Journal of World Business, 43</w:t>
       </w:r>
       <w:r>
-        <w:t xml:space="preserve">(4), 475–485.</w:t>
+        <w:t xml:space="preserve">(4), 475-485.</w:t>
       </w:r>
     </w:p>
     <w:p>
@@ -1725,7 +1725,7 @@
           <w:bCs/>
           <w:b/>
         </w:rPr>
-        <w:t xml:space="preserve">(4), 678–693.</w:t>
+        <w:t xml:space="preserve">(4), 678-693.</w:t>
       </w:r>
       <w:r>
         <w:t xml:space="preserve"> </w:t>
@@ -1796,7 +1796,7 @@
         <w:t xml:space="preserve">Tạp chí Kinh tế và Phát triển, 311</w:t>
       </w:r>
       <w:r>
-        <w:t xml:space="preserve">, 24–38.</w:t>
+        <w:t xml:space="preserve">, 24-38.</w:t>
       </w:r>
     </w:p>
     <w:p>
@@ -2599,7 +2599,7 @@
           <w:iCs/>
           <w:i/>
         </w:rPr>
-        <w:t xml:space="preserve">: Thu nhập thấp ≤$1.135 GNI; Thu nhập trung bình thấp $1.136–$4.495; Thu nhập trung bình cao $4.496–$13.935; Thu nhập cao &gt;$13.935; (b)</w:t>
+        <w:t xml:space="preserve">: Thu nhập thấp ≤$1.135 GNI; Thu nhập trung bình thấp $1.136-$4.495; Thu nhập trung bình cao $4.496-$13.935; Thu nhập cao &gt;$13.935; (b)</w:t>
       </w:r>
       <w:r>
         <w:rPr>
@@ -3467,13 +3467,13 @@
       </w:r>
     </w:p>
     <w:bookmarkEnd w:id="30"/>
-    <w:bookmarkStart w:id="31" w:name="Xde200f04073635a38db4cac94b8061369cfcb08"/>
+    <w:bookmarkStart w:id="31" w:name="Xeaf172b95b80e69e50266cd7ab3722daa97d83f"/>
     <w:p>
       <w:pPr>
         <w:pStyle w:val="Heading2"/>
       </w:pPr>
       <w:r>
-        <w:t xml:space="preserve">L. Tham khảo bổ sung 2024–2026 (cập nhật v2.4)</w:t>
+        <w:t xml:space="preserve">L. Tham khảo bổ sung 2024-2026 (cập nhật v2.4)</w:t>
       </w:r>
     </w:p>
     <w:p>
@@ -3497,7 +3497,7 @@
         <w:t xml:space="preserve"> </w:t>
       </w:r>
       <w:r>
-        <w:t xml:space="preserve">(March 2026, Special Section, pp. 38–43). Asian Development Bank.</w:t>
+        <w:t xml:space="preserve">(March 2026, Special Section, pp. 38-43). Asian Development Bank.</w:t>
       </w:r>
     </w:p>
     <w:p>
@@ -3584,7 +3584,7 @@
           <w:bCs/>
           <w:b/>
         </w:rPr>
-        <w:t xml:space="preserve">(1), 47–65.</w:t>
+        <w:t xml:space="preserve">(1), 47-65.</w:t>
       </w:r>
       <w:r>
         <w:t xml:space="preserve"> </w:t>
@@ -3822,7 +3822,7 @@
           <w:iCs/>
           <w:i/>
         </w:rPr>
-        <w:t xml:space="preserve">(Mới v2.7 — progress slowest on record in 15 of 26 tracked development indicators; SIDS and Sub-Saharan Africa most affected; 75 years of development data: 121,249 data points · 107 datasets; per-capita income growth in LICs 2020–2025 below historical average; poorest quintile lost most ground since COVID-19 disruption.)</w:t>
+        <w:t xml:space="preserve">(Mới v2.7 — progress slowest on record in 15 of 26 tracked development indicators; SIDS and Sub-Saharan Africa most affected; 75 years of development data: 121,249 data points · 107 datasets; per-capita income growth in LICs 2020-2025 below historical average; poorest quintile lost most ground since COVID-19 disruption.)</w:t>
       </w:r>
     </w:p>
     <w:p>
@@ -3903,7 +3903,7 @@
         <w:t xml:space="preserve">Review of Economic Studies, 81</w:t>
       </w:r>
       <w:r>
-        <w:t xml:space="preserve">(2), 572–607. https://doi.org/10.1093/restud/rdt046</w:t>
+        <w:t xml:space="preserve">(2), 572-607. https://doi.org/10.1093/restud/rdt046</w:t>
       </w:r>
     </w:p>
     <w:p>
@@ -3924,15 +3924,15 @@
         <w:t xml:space="preserve">Journal of Management, 17</w:t>
       </w:r>
       <w:r>
-        <w:t xml:space="preserve">(1), 99–120. https://doi.org/10.1177/014920639101700108</w:t>
-      </w:r>
-    </w:p>
-    <w:p>
-      <w:pPr>
-        <w:pStyle w:val="BodyText"/>
-      </w:pPr>
-      <w:r>
-        <w:t xml:space="preserve">Bausch, A., &amp; Krist, M. (2007). The effect of context-related moderators on the internationalization–performance relationship: Evidence from meta-analysis.</w:t>
+        <w:t xml:space="preserve">(1), 99-120. https://doi.org/10.1177/014920639101700108</w:t>
+      </w:r>
+    </w:p>
+    <w:p>
+      <w:pPr>
+        <w:pStyle w:val="BodyText"/>
+      </w:pPr>
+      <w:r>
+        <w:t xml:space="preserve">Bausch, A., &amp; Krist, M. (2007). The effect of context-related moderators on the internationalization-performance relationship: Evidence from meta-analysis.</w:t>
       </w:r>
       <w:r>
         <w:t xml:space="preserve"> </w:t>
@@ -3945,7 +3945,7 @@
         <w:t xml:space="preserve">Management International Review, 47</w:t>
       </w:r>
       <w:r>
-        <w:t xml:space="preserve">(3), 319–347. https://doi.org/10.1007/s11575-007-0019-z</w:t>
+        <w:t xml:space="preserve">(3), 319-347. https://doi.org/10.1007/s11575-007-0019-z</w:t>
       </w:r>
     </w:p>
     <w:p>
@@ -3966,7 +3966,7 @@
         <w:t xml:space="preserve">Biometrics, 50</w:t>
       </w:r>
       <w:r>
-        <w:t xml:space="preserve">(4), 1088–1101. https://doi.org/10.2307/2533446</w:t>
+        <w:t xml:space="preserve">(4), 1088-1101. https://doi.org/10.2307/2533446</w:t>
       </w:r>
     </w:p>
     <w:p>
@@ -3987,7 +3987,7 @@
         <w:t xml:space="preserve">Asia Pacific Viewpoint, 47</w:t>
       </w:r>
       <w:r>
-        <w:t xml:space="preserve">(1), 1–13. https://doi.org/10.1111/j.1467-8373.2006.00297.x</w:t>
+        <w:t xml:space="preserve">(1), 1-13. https://doi.org/10.1111/j.1467-8373.2006.00297.x</w:t>
       </w:r>
     </w:p>
     <w:p>
@@ -4029,7 +4029,7 @@
         <w:t xml:space="preserve">American Economic Journal: Macroeconomics, 13</w:t>
       </w:r>
       <w:r>
-        <w:t xml:space="preserve">(1), 333–372. https://doi.org/10.1257/mac.20180386</w:t>
+        <w:t xml:space="preserve">(1), 333-372. https://doi.org/10.1257/mac.20180386</w:t>
       </w:r>
     </w:p>
     <w:p>
@@ -4050,7 +4050,7 @@
         <w:t xml:space="preserve">Journal of International Business Studies, 38</w:t>
       </w:r>
       <w:r>
-        <w:t xml:space="preserve">(4), 499–518. https://doi.org/10.1057/palgrave.jibs.8400277</w:t>
+        <w:t xml:space="preserve">(4), 499-518. https://doi.org/10.1057/palgrave.jibs.8400277</w:t>
       </w:r>
     </w:p>
     <w:p>
@@ -4071,7 +4071,7 @@
         <w:t xml:space="preserve">Administrative Science Quarterly, 35</w:t>
       </w:r>
       <w:r>
-        <w:t xml:space="preserve">(1), 128–152. https://doi.org/10.2307/2393553</w:t>
+        <w:t xml:space="preserve">(1), 128-152. https://doi.org/10.2307/2393553</w:t>
       </w:r>
     </w:p>
     <w:p>
@@ -4113,15 +4113,15 @@
         <w:t xml:space="preserve">Journal of International Economics, 111</w:t>
       </w:r>
       <w:r>
-        <w:t xml:space="preserve">, 177–189. https://doi.org/10.1016/j.jinteco.2018.01.008</w:t>
-      </w:r>
-    </w:p>
-    <w:p>
-      <w:pPr>
-        <w:pStyle w:val="BodyText"/>
-      </w:pPr>
-      <w:r>
-        <w:t xml:space="preserve">Duval, S., &amp; Tweedie, R. (2000). Trim and fill: A simple funnel-plot–based method of testing and adjusting for publication bias in meta-analysis.</w:t>
+        <w:t xml:space="preserve">, 177-189. https://doi.org/10.1016/j.jinteco.2018.01.008</w:t>
+      </w:r>
+    </w:p>
+    <w:p>
+      <w:pPr>
+        <w:pStyle w:val="BodyText"/>
+      </w:pPr>
+      <w:r>
+        <w:t xml:space="preserve">Duval, S., &amp; Tweedie, R. (2000). Trim and fill: A simple funnel-plot-based method of testing and adjusting for publication bias in meta-analysis.</w:t>
       </w:r>
       <w:r>
         <w:t xml:space="preserve"> </w:t>
@@ -4134,7 +4134,7 @@
         <w:t xml:space="preserve">Biometrics, 56</w:t>
       </w:r>
       <w:r>
-        <w:t xml:space="preserve">(2), 455–463. https://doi.org/10.1111/j.0006-341X.2000.00455.x</w:t>
+        <w:t xml:space="preserve">(2), 455-463. https://doi.org/10.1111/j.0006-341X.2000.00455.x</w:t>
       </w:r>
     </w:p>
     <w:p>
@@ -4155,7 +4155,7 @@
         <w:t xml:space="preserve">Journal of International Business Studies, 51</w:t>
       </w:r>
       <w:r>
-        <w:t xml:space="preserve">(9), 1609–1620. https://doi.org/10.1057/s41267-020-00374-2</w:t>
+        <w:t xml:space="preserve">(9), 1609-1620. https://doi.org/10.1057/s41267-020-00374-2</w:t>
       </w:r>
     </w:p>
     <w:p>
@@ -4176,7 +4176,7 @@
         <w:t xml:space="preserve">British Medical Journal, 315</w:t>
       </w:r>
       <w:r>
-        <w:t xml:space="preserve">(7109), 629–634. https://doi.org/10.1136/bmj.315.7109.629</w:t>
+        <w:t xml:space="preserve">(7109), 629-634. https://doi.org/10.1136/bmj.315.7109.629</w:t>
       </w:r>
     </w:p>
     <w:p>
@@ -4197,7 +4197,7 @@
         <w:t xml:space="preserve">Strategic Management Journal, 37</w:t>
       </w:r>
       <w:r>
-        <w:t xml:space="preserve">(7), 1177–1195. https://doi.org/10.1002/smj.2399</w:t>
+        <w:t xml:space="preserve">(7), 1177-1195. https://doi.org/10.1002/smj.2399</w:t>
       </w:r>
     </w:p>
     <w:p>
@@ -4226,7 +4226,7 @@
         <w:pStyle w:val="BodyText"/>
       </w:pPr>
       <w:r>
-        <w:t xml:space="preserve">Hennart, J.-F. (2007). The theoretical rationale for a multinationality–performance relationship.</w:t>
+        <w:t xml:space="preserve">Hennart, J.-F. (2007). The theoretical rationale for a multinationality-performance relationship.</w:t>
       </w:r>
       <w:r>
         <w:t xml:space="preserve"> </w:t>
@@ -4239,7 +4239,7 @@
         <w:t xml:space="preserve">Management International Review, 47</w:t>
       </w:r>
       <w:r>
-        <w:t xml:space="preserve">(3), 423–452. https://doi.org/10.1007/s11575-007-0022-4</w:t>
+        <w:t xml:space="preserve">(3), 423-452. https://doi.org/10.1007/s11575-007-0022-4</w:t>
       </w:r>
     </w:p>
     <w:p>
@@ -4260,7 +4260,7 @@
         <w:t xml:space="preserve">Academy of Management Journal, 40</w:t>
       </w:r>
       <w:r>
-        <w:t xml:space="preserve">(4), 767–798. https://doi.org/10.2307/256948</w:t>
+        <w:t xml:space="preserve">(4), 767-798. https://doi.org/10.2307/256948</w:t>
       </w:r>
     </w:p>
     <w:p>
@@ -4281,7 +4281,7 @@
         <w:t xml:space="preserve">Quarterly Journal of Economics, 124</w:t>
       </w:r>
       <w:r>
-        <w:t xml:space="preserve">(4), 1403–1448. https://doi.org/10.1162/qjec.2009.124.4.1403</w:t>
+        <w:t xml:space="preserve">(4), 1403-1448. https://doi.org/10.1162/qjec.2009.124.4.1403</w:t>
       </w:r>
     </w:p>
     <w:p>
@@ -4302,7 +4302,7 @@
         <w:t xml:space="preserve">Multinational Business Review, 11</w:t>
       </w:r>
       <w:r>
-        <w:t xml:space="preserve">(3), 23–49. https://doi.org/10.1108/1525383X200300015</w:t>
+        <w:t xml:space="preserve">(3), 23-49. https://doi.org/10.1108/1525383X200300015</w:t>
       </w:r>
     </w:p>
     <w:p>
@@ -4323,7 +4323,7 @@
         <w:t xml:space="preserve">Journal of World Business, 48</w:t>
       </w:r>
       <w:r>
-        <w:t xml:space="preserve">(1), 1–12. https://doi.org/10.1016/j.jwb.2012.06.001</w:t>
+        <w:t xml:space="preserve">(1), 1-12. https://doi.org/10.1016/j.jwb.2012.06.001</w:t>
       </w:r>
     </w:p>
     <w:p>
@@ -4344,7 +4344,7 @@
         <w:t xml:space="preserve">Journal of International Business Studies, 8</w:t>
       </w:r>
       <w:r>
-        <w:t xml:space="preserve">(1), 23–32. https://doi.org/10.1057/palgrave.jibs.8490676</w:t>
+        <w:t xml:space="preserve">(1), 23-32. https://doi.org/10.1057/palgrave.jibs.8490676</w:t>
       </w:r>
     </w:p>
     <w:p>
@@ -4365,15 +4365,15 @@
         <w:t xml:space="preserve">Journal of International Business Studies, 51</w:t>
       </w:r>
       <w:r>
-        <w:t xml:space="preserve">(4), 577–622. https://doi.org/10.1057/s41267-020-00304-2</w:t>
-      </w:r>
-    </w:p>
-    <w:p>
-      <w:pPr>
-        <w:pStyle w:val="BodyText"/>
-      </w:pPr>
-      <w:r>
-        <w:t xml:space="preserve">Karna, A., Richter, A., &amp; Riesenkampff, E. (2016). Revisiting the role of the environment in the capabilities–financial performance relationship: A meta-analysis.</w:t>
+        <w:t xml:space="preserve">(4), 577-622. https://doi.org/10.1057/s41267-020-00304-2</w:t>
+      </w:r>
+    </w:p>
+    <w:p>
+      <w:pPr>
+        <w:pStyle w:val="BodyText"/>
+      </w:pPr>
+      <w:r>
+        <w:t xml:space="preserve">Karna, A., Richter, A., &amp; Riesenkampff, E. (2016). Revisiting the role of the environment in the capabilities-financial performance relationship: A meta-analysis.</w:t>
       </w:r>
       <w:r>
         <w:t xml:space="preserve"> </w:t>
@@ -4386,7 +4386,7 @@
         <w:t xml:space="preserve">Strategic Management Journal, 37</w:t>
       </w:r>
       <w:r>
-        <w:t xml:space="preserve">(6), 1154–1173. https://doi.org/10.1002/smj.2379</w:t>
+        <w:t xml:space="preserve">(6), 1154-1173. https://doi.org/10.1002/smj.2379</w:t>
       </w:r>
     </w:p>
     <w:p>
@@ -4428,7 +4428,7 @@
         <w:t xml:space="preserve">Journal of International Business Studies, 35</w:t>
       </w:r>
       <w:r>
-        <w:t xml:space="preserve">(2), 124–141. https://doi.org/10.1057/palgrave.jibs.8400071</w:t>
+        <w:t xml:space="preserve">(2), 124-141. https://doi.org/10.1057/palgrave.jibs.8400071</w:t>
       </w:r>
     </w:p>
     <w:p>
@@ -4449,7 +4449,7 @@
         <w:t xml:space="preserve">Journal of Economic Perspectives, 28</w:t>
       </w:r>
       <w:r>
-        <w:t xml:space="preserve">(3), 109–126. https://doi.org/10.1257/jep.28.3.109</w:t>
+        <w:t xml:space="preserve">(3), 109-126. https://doi.org/10.1257/jep.28.3.109</w:t>
       </w:r>
     </w:p>
     <w:p>
@@ -4470,7 +4470,7 @@
         <w:t xml:space="preserve">World Development, 20</w:t>
       </w:r>
       <w:r>
-        <w:t xml:space="preserve">(2), 165–186. https://doi.org/10.1016/0305-750X(92)90097-F</w:t>
+        <w:t xml:space="preserve">(2), 165-186. https://doi.org/10.1016/0305-750X(92)90097-F</w:t>
       </w:r>
     </w:p>
     <w:p>
@@ -4512,7 +4512,7 @@
         <w:t xml:space="preserve">Oxford Bulletin of Economics and Statistics, 72</w:t>
       </w:r>
       <w:r>
-        <w:t xml:space="preserve">(1), 109–118. https://doi.org/10.1111/j.1468-0084.2009.00569.x</w:t>
+        <w:t xml:space="preserve">(1), 109-118. https://doi.org/10.1111/j.1468-0084.2009.00569.x</w:t>
       </w:r>
     </w:p>
     <w:p>
@@ -4533,7 +4533,7 @@
         <w:t xml:space="preserve">The American Statistician, 54</w:t>
       </w:r>
       <w:r>
-        <w:t xml:space="preserve">(3), 217–224. https://doi.org/10.1080/00031305.2000.10474549</w:t>
+        <w:t xml:space="preserve">(3), 217-224. https://doi.org/10.1080/00031305.2000.10474549</w:t>
       </w:r>
     </w:p>
     <w:p>
@@ -4554,7 +4554,7 @@
         <w:t xml:space="preserve">Academy of Management Journal, 47</w:t>
       </w:r>
       <w:r>
-        <w:t xml:space="preserve">(4), 598–609. https://doi.org/10.2307/20159604</w:t>
+        <w:t xml:space="preserve">(4), 598-609. https://doi.org/10.2307/20159604</w:t>
       </w:r>
     </w:p>
     <w:p>
@@ -4575,7 +4575,7 @@
         <w:t xml:space="preserve">Journal of Econometrics, 29</w:t>
       </w:r>
       <w:r>
-        <w:t xml:space="preserve">(3), 305–325. https://doi.org/10.1016/0304-4076(85)90158-7</w:t>
+        <w:t xml:space="preserve">(3), 305-325. https://doi.org/10.1016/0304-4076(85)90158-7</w:t>
       </w:r>
     </w:p>
     <w:p>
@@ -4596,7 +4596,7 @@
         <w:t xml:space="preserve">Review of Economic Studies, 80</w:t>
       </w:r>
       <w:r>
-        <w:t xml:space="preserve">(2), 711–744. https://doi.org/10.1093/restud/rds036</w:t>
+        <w:t xml:space="preserve">(2), 711-744. https://doi.org/10.1093/restud/rds036</w:t>
       </w:r>
     </w:p>
     <w:p>
@@ -4614,7 +4614,7 @@
           <w:iCs/>
           <w:i/>
         </w:rPr>
-        <w:t xml:space="preserve">Digital adoption and the internationalization–performance curve: Evidence from Singapore firms</w:t>
+        <w:t xml:space="preserve">Digital adoption and the internationalization-performance curve: Evidence from Singapore firms</w:t>
       </w:r>
       <w:r>
         <w:t xml:space="preserve"> </w:t>
@@ -4641,7 +4641,7 @@
         <w:pStyle w:val="BodyText"/>
       </w:pPr>
       <w:r>
-        <w:t xml:space="preserve">Marano, V., Arregle, J.-L., Hitt, M. A., Spadafora, E., &amp; van Essen, M. (2016). Home country institutions and the internationalization–performance relationship: A meta-analytic review.</w:t>
+        <w:t xml:space="preserve">Marano, V., Arregle, J.-L., Hitt, M. A., Spadafora, E., &amp; van Essen, M. (2016). Home country institutions and the internationalization-performance relationship: A meta-analytic review.</w:t>
       </w:r>
       <w:r>
         <w:t xml:space="preserve"> </w:t>
@@ -4654,7 +4654,7 @@
         <w:t xml:space="preserve">Journal of Management, 42</w:t>
       </w:r>
       <w:r>
-        <w:t xml:space="preserve">(5), 1075–1110. https://doi.org/10.1177/0149206315624963</w:t>
+        <w:t xml:space="preserve">(5), 1075-1110. https://doi.org/10.1177/0149206315624963</w:t>
       </w:r>
     </w:p>
     <w:p>
@@ -4675,7 +4675,7 @@
         <w:t xml:space="preserve">Journal of International Business Studies, 48</w:t>
       </w:r>
       <w:r>
-        <w:t xml:space="preserve">(5), 535–551. https://doi.org/10.1057/s41267-017-0078-8</w:t>
+        <w:t xml:space="preserve">(5), 535-551. https://doi.org/10.1057/s41267-017-0078-8</w:t>
       </w:r>
     </w:p>
     <w:p>
@@ -4717,7 +4717,7 @@
         <w:t xml:space="preserve">Criminology, 36</w:t>
       </w:r>
       <w:r>
-        <w:t xml:space="preserve">(4), 859–866. https://doi.org/10.1111/j.1745-9125.1998.tb01268.x</w:t>
+        <w:t xml:space="preserve">(4), 859-866. https://doi.org/10.1111/j.1745-9125.1998.tb01268.x</w:t>
       </w:r>
     </w:p>
     <w:p>
@@ -4738,7 +4738,7 @@
         <w:t xml:space="preserve">Journal of Management, 39</w:t>
       </w:r>
       <w:r>
-        <w:t xml:space="preserve">(2), 313–338. https://doi.org/10.1177/0149206311410060</w:t>
+        <w:t xml:space="preserve">(2), 313-338. https://doi.org/10.1177/0149206311410060</w:t>
       </w:r>
     </w:p>
     <w:p>
@@ -4759,7 +4759,7 @@
         <w:t xml:space="preserve">Academy of Management Journal, 58</w:t>
       </w:r>
       <w:r>
-        <w:t xml:space="preserve">(5), 1546–1571. https://doi.org/10.5465/amj.2013.0319</w:t>
+        <w:t xml:space="preserve">(5), 1546-1571. https://doi.org/10.5465/amj.2013.0319</w:t>
       </w:r>
     </w:p>
     <w:p>
@@ -4780,7 +4780,7 @@
         <w:t xml:space="preserve">International Business Review, 7</w:t>
       </w:r>
       <w:r>
-        <w:t xml:space="preserve">(3), 315–321. https://doi.org/10.1016/S0969-5931(98)00013-4</w:t>
+        <w:t xml:space="preserve">(3), 315-321. https://doi.org/10.1016/S0969-5931(98)00013-4</w:t>
       </w:r>
     </w:p>
     <w:p>
@@ -4801,7 +4801,7 @@
         <w:t xml:space="preserve">Research Synthesis Methods, 8</w:t>
       </w:r>
       <w:r>
-        <w:t xml:space="preserve">(4), 537–553. https://doi.org/10.1002/jrsm.1260</w:t>
+        <w:t xml:space="preserve">(4), 537-553. https://doi.org/10.1002/jrsm.1260</w:t>
       </w:r>
     </w:p>
     <w:p>
@@ -4822,7 +4822,7 @@
         <w:t xml:space="preserve">Academy of Management Journal, 39</w:t>
       </w:r>
       <w:r>
-        <w:t xml:space="preserve">(1), 179–196. https://doi.org/10.2307/256635</w:t>
+        <w:t xml:space="preserve">(1), 179-196. https://doi.org/10.2307/256635</w:t>
       </w:r>
     </w:p>
     <w:p>
@@ -4843,7 +4843,7 @@
         <w:t xml:space="preserve">Strategic Management Journal, 28</w:t>
       </w:r>
       <w:r>
-        <w:t xml:space="preserve">(13), 1319–1350. https://doi.org/10.1002/smj.640</w:t>
+        <w:t xml:space="preserve">(13), 1319-1350. https://doi.org/10.1002/smj.640</w:t>
       </w:r>
     </w:p>
     <w:p>
@@ -4864,7 +4864,7 @@
         <w:t xml:space="preserve">Strategic Management Journal, 18</w:t>
       </w:r>
       <w:r>
-        <w:t xml:space="preserve">(7), 509–533. https://doi.org/10.1002/smj.4250180702</w:t>
+        <w:t xml:space="preserve">(7), 509-533. https://doi.org/10.1002/smj.4250180702</w:t>
       </w:r>
     </w:p>
     <w:p>
@@ -4885,7 +4885,7 @@
         <w:t xml:space="preserve">Human Resource Development Review, 4</w:t>
       </w:r>
       <w:r>
-        <w:t xml:space="preserve">(3), 356–367. https://doi.org/10.1177/1534484305278283</w:t>
+        <w:t xml:space="preserve">(3), 356-367. https://doi.org/10.1177/1534484305278283</w:t>
       </w:r>
     </w:p>
     <w:p>
@@ -4927,7 +4927,7 @@
         <w:t xml:space="preserve">The World Economy, 30</w:t>
       </w:r>
       <w:r>
-        <w:t xml:space="preserve">(1), 60–82. https://doi.org/10.1111/j.1467-9701.2007.00872.x</w:t>
+        <w:t xml:space="preserve">(1), 60-82. https://doi.org/10.1111/j.1467-9701.2007.00872.x</w:t>
       </w:r>
     </w:p>
     <w:p>
@@ -4972,7 +4972,7 @@
         <w:t xml:space="preserve">Academy of Management Journal, 38</w:t>
       </w:r>
       <w:r>
-        <w:t xml:space="preserve">(2), 341–363. https://doi.org/10.2307/256411</w:t>
+        <w:t xml:space="preserve">(2), 341-363. https://doi.org/10.2307/256411</w:t>
       </w:r>
     </w:p>
     <w:p>
@@ -5235,7 +5235,7 @@
           <w:iCs/>
           <w:i/>
         </w:rPr>
-        <w:t xml:space="preserve">(Cited in P5 §2 — trade re-equilibration, US–China tariff cycle, bilateral trade flow reorientation; Poverty and Equity Global Practice, October 2024.)</w:t>
+        <w:t xml:space="preserve">(Cited in P5 §2 — trade re-equilibration, US-China tariff cycle, bilateral trade flow reorientation; Poverty and Equity Global Practice, October 2024.)</w:t>
       </w:r>
     </w:p>
     <w:p>
@@ -5268,7 +5268,7 @@
         <w:t xml:space="preserve">European Journal of Development Research, 33</w:t>
       </w:r>
       <w:r>
-        <w:t xml:space="preserve">(2), 304–329. https://doi.org/10.1057/s41287-021-00364-6</w:t>
+        <w:t xml:space="preserve">(2), 304-329. https://doi.org/10.1057/s41287-021-00364-6</w:t>
       </w:r>
     </w:p>
     <w:p>
@@ -5289,7 +5289,7 @@
         <w:t xml:space="preserve">Journal of Management Studies, 57</w:t>
       </w:r>
       <w:r>
-        <w:t xml:space="preserve">(1), 1–24. https://doi.org/10.1111/joms.12526</w:t>
+        <w:t xml:space="preserve">(1), 1-24. https://doi.org/10.1111/joms.12526</w:t>
       </w:r>
     </w:p>
     <w:p>
@@ -5310,7 +5310,7 @@
         <w:t xml:space="preserve">Advances in Methods and Practices in Psychological Science, 1</w:t>
       </w:r>
       <w:r>
-        <w:t xml:space="preserve">(2), 259–269. https://doi.org/10.1177/2515245918770963</w:t>
+        <w:t xml:space="preserve">(2), 259-269. https://doi.org/10.1177/2515245918770963</w:t>
       </w:r>
     </w:p>
     <w:p>
@@ -5352,15 +5352,15 @@
         <w:t xml:space="preserve">Strategic Management Journal, 21</w:t>
       </w:r>
       <w:r>
-        <w:t xml:space="preserve">(10–11), 1105–1121. https://doi.org/10.1002/smj.118</w:t>
-      </w:r>
-    </w:p>
-    <w:p>
-      <w:pPr>
-        <w:pStyle w:val="BodyText"/>
-      </w:pPr>
-      <w:r>
-        <w:t xml:space="preserve">Kirca, A. H., Roth, K., Hult, G. T. M., &amp; Cavusgil, S. T. (2012). The role of context in the multinationality–performance relationship: A meta-analytic review.</w:t>
+        <w:t xml:space="preserve">(10-11), 1105-1121. https://doi.org/10.1002/smj.118</w:t>
+      </w:r>
+    </w:p>
+    <w:p>
+      <w:pPr>
+        <w:pStyle w:val="BodyText"/>
+      </w:pPr>
+      <w:r>
+        <w:t xml:space="preserve">Kirca, A. H., Roth, K., Hult, G. T. M., &amp; Cavusgil, S. T. (2012). The role of context in the multinationality-performance relationship: A meta-analytic review.</w:t>
       </w:r>
       <w:r>
         <w:t xml:space="preserve"> </w:t>
@@ -5373,7 +5373,7 @@
         <w:t xml:space="preserve">Global Strategy Journal, 2</w:t>
       </w:r>
       <w:r>
-        <w:t xml:space="preserve">(2), 108–121. https://doi.org/10.1111/j.2042-5805.2012.01028.x</w:t>
+        <w:t xml:space="preserve">(2), 108-121. https://doi.org/10.1111/j.2042-5805.2012.01028.x</w:t>
       </w:r>
     </w:p>
     <w:p>
@@ -5394,7 +5394,7 @@
         <w:t xml:space="preserve">Econometrica, 71</w:t>
       </w:r>
       <w:r>
-        <w:t xml:space="preserve">(6), 1695–1725. https://doi.org/10.1111/1468-0262.00467</w:t>
+        <w:t xml:space="preserve">(6), 1695-1725. https://doi.org/10.1111/1468-0262.00467</w:t>
       </w:r>
     </w:p>
     <w:p>
@@ -5436,7 +5436,7 @@
         <w:t xml:space="preserve">Journal of Management, 46</w:t>
       </w:r>
       <w:r>
-        <w:t xml:space="preserve">(7), 1244–1256. https://doi.org/10.1177/0149206319846272</w:t>
+        <w:t xml:space="preserve">(7), 1244-1256. https://doi.org/10.1177/0149206319846272</w:t>
       </w:r>
     </w:p>
     <w:p>
@@ -5526,7 +5526,7 @@
           <w:iCs/>
           <w:i/>
         </w:rPr>
-        <w:t xml:space="preserve">(Mới v2.9 — Vietnam DVAR tăng mạnh từ 2018: US demand shock 8,76% → DVAR +2,49 pp trong 2018–2020, giải thích 68,5% tổng tăng DVAR; firms phản ứng bằng cách xuất khẩu nhiều hơn sang cả US và non-US markets và ghi nhận tăng năng suất lao động; non-Chinese-owned firms là động lực chính; cơ chế: implicit rules of origin + FDI vào intermediates. Sử dụng matched firm-level + customs data 2016–2020. Cited P3 §5 Discussion — corroboration cho ascending-limb mechanism.)</w:t>
+        <w:t xml:space="preserve">(Mới v2.9 — Vietnam DVAR tăng mạnh từ 2018: US demand shock 8,76% → DVAR +2,49 pp trong 2018-2020, giải thích 68,5% tổng tăng DVAR; firms phản ứng bằng cách xuất khẩu nhiều hơn sang cả US và non-US markets và ghi nhận tăng năng suất lao động; non-Chinese-owned firms là động lực chính; cơ chế: implicit rules of origin + FDI vào intermediates. Sử dụng matched firm-level + customs data 2016-2020. Cited P3 §5 Discussion — corroboration cho ascending-limb mechanism.)</w:t>
       </w:r>
     </w:p>
     <w:p>
@@ -5560,7 +5560,7 @@
           <w:iCs/>
           <w:i/>
         </w:rPr>
-        <w:t xml:space="preserve">(Mới v2.9 — Vietnam: liberalization dịch vụ thương mại 2008–2016 → +2,9% năng suất hàng năm trong dịch vụ, +3,1% trong sản xuất;</w:t>
+        <w:t xml:space="preserve">(Mới v2.9 — Vietnam: liberalization dịch vụ thương mại 2008-2016 → +2,9% năng suất hàng năm trong dịch vụ, +3,1% trong sản xuất;</w:t>
       </w:r>
       <w:r>
         <w:rPr>
@@ -5926,7 +5926,7 @@
         <w:pStyle w:val="Compact"/>
       </w:pPr>
       <w:r>
-        <w:t xml:space="preserve">Dùng in-text citation theo author–date.</w:t>
+        <w:t xml:space="preserve">Dùng in-text citation theo author-date.</w:t>
       </w:r>
     </w:p>
     <w:p>
@@ -7234,7 +7234,7 @@
         <w:t xml:space="preserve">Journal of International Business Studies, 49</w:t>
       </w:r>
       <w:r>
-        <w:t xml:space="preserve">(7), 832–857. https://doi.org/10.1057/s41267-017-0117-9</w:t>
+        <w:t xml:space="preserve">(7), 832-857. https://doi.org/10.1057/s41267-017-0117-9</w:t>
       </w:r>
     </w:p>
     <w:p>
@@ -7276,7 +7276,7 @@
         <w:t xml:space="preserve">British Journal of Management, 25</w:t>
       </w:r>
       <w:r>
-        <w:t xml:space="preserve">(S1), S6–S23. https://doi.org/10.1111/1467-8551.12048</w:t>
+        <w:t xml:space="preserve">(S1), S6-S23. https://doi.org/10.1111/1467-8551.12048</w:t>
       </w:r>
     </w:p>
     <w:p>
@@ -7297,7 +7297,7 @@
         <w:t xml:space="preserve">Pakistan Journal of Commerce and Social Sciences, 10</w:t>
       </w:r>
       <w:r>
-        <w:t xml:space="preserve">(1), 76–90.</w:t>
+        <w:t xml:space="preserve">(1), 76-90.</w:t>
       </w:r>
     </w:p>
     <w:p>
@@ -7318,7 +7318,7 @@
         <w:t xml:space="preserve">International Journal of Hospitality Management, 31</w:t>
       </w:r>
       <w:r>
-        <w:t xml:space="preserve">(1), 39–48. https://doi.org/10.1016/j.ijhm.2011.05.003</w:t>
+        <w:t xml:space="preserve">(1), 39-48. https://doi.org/10.1016/j.ijhm.2011.05.003</w:t>
       </w:r>
     </w:p>
     <w:p>
@@ -7339,7 +7339,7 @@
         <w:t xml:space="preserve">Annals of Tourism Research, 57</w:t>
       </w:r>
       <w:r>
-        <w:t xml:space="preserve">, 100–112. https://doi.org/10.1016/j.annals.2015.12.008</w:t>
+        <w:t xml:space="preserve">, 100-112. https://doi.org/10.1016/j.annals.2015.12.008</w:t>
       </w:r>
     </w:p>
     <w:p>
@@ -7360,7 +7360,7 @@
         <w:t xml:space="preserve">Multinational Business Review, 16</w:t>
       </w:r>
       <w:r>
-        <w:t xml:space="preserve">(1), 53–77. https://doi.org/10.1108/1525383X200800003</w:t>
+        <w:t xml:space="preserve">(1), 53-77. https://doi.org/10.1108/1525383X200800003</w:t>
       </w:r>
     </w:p>
     <w:p>
@@ -7381,7 +7381,7 @@
         <w:t xml:space="preserve">International Business Review, 24</w:t>
       </w:r>
       <w:r>
-        <w:t xml:space="preserve">(5), 893–907. https://doi.org/10.1016/j.ibusrev.2015.03.003</w:t>
+        <w:t xml:space="preserve">(5), 893-907. https://doi.org/10.1016/j.ibusrev.2015.03.003</w:t>
       </w:r>
     </w:p>
     <w:p>
@@ -7402,7 +7402,7 @@
         <w:t xml:space="preserve">Strategic Management Journal, 37</w:t>
       </w:r>
       <w:r>
-        <w:t xml:space="preserve">(11), 2275–2290. https://doi.org/10.1002/smj.2429</w:t>
+        <w:t xml:space="preserve">(11), 2275-2290. https://doi.org/10.1002/smj.2429</w:t>
       </w:r>
     </w:p>
     <w:p>
@@ -7423,7 +7423,7 @@
         <w:t xml:space="preserve">Journal of Small Business Management, 56</w:t>
       </w:r>
       <w:r>
-        <w:t xml:space="preserve">(S1), 170–185. https://doi.org/10.1111/jsbm.12393</w:t>
+        <w:t xml:space="preserve">(S1), 170-185. https://doi.org/10.1111/jsbm.12393</w:t>
       </w:r>
     </w:p>
     <w:p>
@@ -7444,7 +7444,7 @@
         <w:t xml:space="preserve">Journal of Business Research, 72</w:t>
       </w:r>
       <w:r>
-        <w:t xml:space="preserve">, 104–113. https://doi.org/10.1016/j.jbusres.2016.11.021</w:t>
+        <w:t xml:space="preserve">, 104-113. https://doi.org/10.1016/j.jbusres.2016.11.021</w:t>
       </w:r>
     </w:p>
     <w:p>
@@ -7465,7 +7465,7 @@
         <w:t xml:space="preserve">International Journal of Contemporary Hospitality Management, 28</w:t>
       </w:r>
       <w:r>
-        <w:t xml:space="preserve">(1), 179–202. https://doi.org/10.1108/IJCHM-10-2014-0517</w:t>
+        <w:t xml:space="preserve">(1), 179-202. https://doi.org/10.1108/IJCHM-10-2014-0517</w:t>
       </w:r>
     </w:p>
     <w:p>
@@ -7486,7 +7486,7 @@
         <w:t xml:space="preserve">International Business Review, 17</w:t>
       </w:r>
       <w:r>
-        <w:t xml:space="preserve">(5), 600–615. https://doi.org/10.1016/j.ibusrev.2008.08.001</w:t>
+        <w:t xml:space="preserve">(5), 600-615. https://doi.org/10.1016/j.ibusrev.2008.08.001</w:t>
       </w:r>
     </w:p>
     <w:p>
@@ -7507,7 +7507,7 @@
         <w:t xml:space="preserve">Journal of International Business Studies, 34</w:t>
       </w:r>
       <w:r>
-        <w:t xml:space="preserve">(4), 345–355. https://doi.org/10.1057/palgrave.jibs.8400036</w:t>
+        <w:t xml:space="preserve">(4), 345-355. https://doi.org/10.1057/palgrave.jibs.8400036</w:t>
       </w:r>
     </w:p>
     <w:p>
@@ -7528,7 +7528,7 @@
         <w:t xml:space="preserve">Journal of Management, 30</w:t>
       </w:r>
       <w:r>
-        <w:t xml:space="preserve">(4), 509–528. https://doi.org/10.1016/j.jm.2004.02.001</w:t>
+        <w:t xml:space="preserve">(4), 509-528. https://doi.org/10.1016/j.jm.2004.02.001</w:t>
       </w:r>
     </w:p>
     <w:p>
@@ -7549,7 +7549,7 @@
         <w:t xml:space="preserve">Journal of World Business, 45</w:t>
       </w:r>
       <w:r>
-        <w:t xml:space="preserve">(1), 93–103. https://doi.org/10.1016/j.jwb.2009.04.005</w:t>
+        <w:t xml:space="preserve">(1), 93-103. https://doi.org/10.1016/j.jwb.2009.04.005</w:t>
       </w:r>
     </w:p>
     <w:p>
@@ -7570,7 +7570,7 @@
         <w:t xml:space="preserve">Journal of World Business, 42</w:t>
       </w:r>
       <w:r>
-        <w:t xml:space="preserve">(2), 184–197. https://doi.org/10.1016/j.jwb.2007.02.007</w:t>
+        <w:t xml:space="preserve">(2), 184-197. https://doi.org/10.1016/j.jwb.2007.02.007</w:t>
       </w:r>
     </w:p>
     <w:p>
@@ -7591,7 +7591,7 @@
         <w:t xml:space="preserve">International Journal of Entrepreneurship and Small Business, 14</w:t>
       </w:r>
       <w:r>
-        <w:t xml:space="preserve">(4), 496–518. https://doi.org/10.1504/IJESB.2011.043273</w:t>
+        <w:t xml:space="preserve">(4), 496-518. https://doi.org/10.1504/IJESB.2011.043273</w:t>
       </w:r>
     </w:p>
     <w:p>
@@ -7612,7 +7612,7 @@
         <w:t xml:space="preserve">Small Business Economics, 26</w:t>
       </w:r>
       <w:r>
-        <w:t xml:space="preserve">(5), 475–492. https://doi.org/10.1007/s11187-005-5604-6</w:t>
+        <w:t xml:space="preserve">(5), 475-492. https://doi.org/10.1007/s11187-005-5604-6</w:t>
       </w:r>
     </w:p>
     <w:p>
@@ -7633,7 +7633,7 @@
         <w:t xml:space="preserve">Management Research Review, 41</w:t>
       </w:r>
       <w:r>
-        <w:t xml:space="preserve">(9), 1053–1071. https://doi.org/10.1108/MRR-06-2017-0175</w:t>
+        <w:t xml:space="preserve">(9), 1053-1071. https://doi.org/10.1108/MRR-06-2017-0175</w:t>
       </w:r>
     </w:p>
     <w:p>
@@ -7654,7 +7654,7 @@
         <w:t xml:space="preserve">Organizacija, 43</w:t>
       </w:r>
       <w:r>
-        <w:t xml:space="preserve">(5), 175–185. https://doi.org/10.2478/v10051-010-0017-y</w:t>
+        <w:t xml:space="preserve">(5), 175-185. https://doi.org/10.2478/v10051-010-0017-y</w:t>
       </w:r>
     </w:p>
     <w:p>
@@ -7675,7 +7675,7 @@
         <w:t xml:space="preserve">Multinational Business Review, 14</w:t>
       </w:r>
       <w:r>
-        <w:t xml:space="preserve">(3), 21–45. https://doi.org/10.1108/1525383X200600015</w:t>
+        <w:t xml:space="preserve">(3), 21-45. https://doi.org/10.1108/1525383X200600015</w:t>
       </w:r>
     </w:p>
     <w:p>
@@ -7696,7 +7696,7 @@
         <w:t xml:space="preserve">Asian Business &amp; Management, 10</w:t>
       </w:r>
       <w:r>
-        <w:t xml:space="preserve">(4), 515–535. https://doi.org/10.1057/abm.2011.27</w:t>
+        <w:t xml:space="preserve">(4), 515-535. https://doi.org/10.1057/abm.2011.27</w:t>
       </w:r>
     </w:p>
     <w:p>
@@ -7717,7 +7717,7 @@
         <w:t xml:space="preserve">Journal of Business Venturing, 28</w:t>
       </w:r>
       <w:r>
-        <w:t xml:space="preserve">(2), 316–334. https://doi.org/10.1016/j.jbusvent.2012.05.002</w:t>
+        <w:t xml:space="preserve">(2), 316-334. https://doi.org/10.1016/j.jbusvent.2012.05.002</w:t>
       </w:r>
     </w:p>
     <w:p>
@@ -7738,7 +7738,7 @@
         <w:t xml:space="preserve">Academy of Management Proceedings, 2007</w:t>
       </w:r>
       <w:r>
-        <w:t xml:space="preserve">(1), 1–6. https://doi.org/10.5465/ambpp.2007.26508474</w:t>
+        <w:t xml:space="preserve">(1), 1-6. https://doi.org/10.5465/ambpp.2007.26508474</w:t>
       </w:r>
     </w:p>
     <w:p>
@@ -7759,7 +7759,7 @@
         <w:t xml:space="preserve">South Asian Journal of Business Studies, 6</w:t>
       </w:r>
       <w:r>
-        <w:t xml:space="preserve">(3), 259–282. https://doi.org/10.1108/SAJBS-03-2016-0020</w:t>
+        <w:t xml:space="preserve">(3), 259-282. https://doi.org/10.1108/SAJBS-03-2016-0020</w:t>
       </w:r>
     </w:p>
     <w:p>
@@ -7780,7 +7780,7 @@
         <w:t xml:space="preserve">Journal of International Management, 15</w:t>
       </w:r>
       <w:r>
-        <w:t xml:space="preserve">(4), 413–431. https://doi.org/10.1016/j.intman.2009.01.003</w:t>
+        <w:t xml:space="preserve">(4), 413-431. https://doi.org/10.1016/j.intman.2009.01.003</w:t>
       </w:r>
     </w:p>
     <w:p>
@@ -7801,7 +7801,7 @@
         <w:t xml:space="preserve">Management International Review, 47</w:t>
       </w:r>
       <w:r>
-        <w:t xml:space="preserve">(3), 307–317. https://doi.org/10.1007/s11575-007-0018-0</w:t>
+        <w:t xml:space="preserve">(3), 307-317. https://doi.org/10.1007/s11575-007-0018-0</w:t>
       </w:r>
     </w:p>
     <w:p>
@@ -7822,7 +7822,7 @@
         <w:t xml:space="preserve">British Journal of Management, 20</w:t>
       </w:r>
       <w:r>
-        <w:t xml:space="preserve">(2), 172–186. https://doi.org/10.1111/j.1467-8551.2008.00558.x</w:t>
+        <w:t xml:space="preserve">(2), 172-186. https://doi.org/10.1111/j.1467-8551.2008.00558.x</w:t>
       </w:r>
     </w:p>
     <w:p>
@@ -7843,7 +7843,7 @@
         <w:t xml:space="preserve">Family Business Review, 27</w:t>
       </w:r>
       <w:r>
-        <w:t xml:space="preserve">(2), 142–160. https://doi.org/10.1177/0894486513510534</w:t>
+        <w:t xml:space="preserve">(2), 142-160. https://doi.org/10.1177/0894486513510534</w:t>
       </w:r>
     </w:p>
     <w:p>
@@ -7864,7 +7864,7 @@
         <w:t xml:space="preserve">International Small Business Journal, 32</w:t>
       </w:r>
       <w:r>
-        <w:t xml:space="preserve">(4), 386–400. https://doi.org/10.1177/0266242613485778</w:t>
+        <w:t xml:space="preserve">(4), 386-400. https://doi.org/10.1177/0266242613485778</w:t>
       </w:r>
     </w:p>
     <w:p>
@@ -7885,7 +7885,7 @@
         <w:t xml:space="preserve">Economics Research-Ekonomska Istraživanja, 31</w:t>
       </w:r>
       <w:r>
-        <w:t xml:space="preserve">(1), 1770–1789. https://doi.org/10.1080/1331677X.2018.1504673</w:t>
+        <w:t xml:space="preserve">(1), 1770-1789. https://doi.org/10.1080/1331677X.2018.1504673</w:t>
       </w:r>
     </w:p>
     <w:p>
@@ -7906,7 +7906,7 @@
         <w:t xml:space="preserve">International Journal of Business and Society, 20</w:t>
       </w:r>
       <w:r>
-        <w:t xml:space="preserve">(3), 1134–1152.</w:t>
+        <w:t xml:space="preserve">(3), 1134-1152.</w:t>
       </w:r>
     </w:p>
     <w:p>
@@ -7927,7 +7927,7 @@
         <w:t xml:space="preserve">Journal of International Business and Economy, 22</w:t>
       </w:r>
       <w:r>
-        <w:t xml:space="preserve">(2), 1–22.</w:t>
+        <w:t xml:space="preserve">(2), 1-22.</w:t>
       </w:r>
     </w:p>
     <w:p>
@@ -7948,7 +7948,7 @@
         <w:t xml:space="preserve">Vikalpa: The Journal for Decision Makers, 33</w:t>
       </w:r>
       <w:r>
-        <w:t xml:space="preserve">(4), 13–24.</w:t>
+        <w:t xml:space="preserve">(4), 13-24.</w:t>
       </w:r>
     </w:p>
     <w:p>
@@ -7969,7 +7969,7 @@
         <w:t xml:space="preserve">International Business: Research, Teaching, and Practice, 1</w:t>
       </w:r>
       <w:r>
-        <w:t xml:space="preserve">(1), 1–20.</w:t>
+        <w:t xml:space="preserve">(1), 1-20.</w:t>
       </w:r>
     </w:p>
     <w:p>
@@ -7990,7 +7990,7 @@
         <w:t xml:space="preserve">Asian Review of Accounting, 21</w:t>
       </w:r>
       <w:r>
-        <w:t xml:space="preserve">(2), 115–133. https://doi.org/10.1108/ARA-09-2012-0061</w:t>
+        <w:t xml:space="preserve">(2), 115-133. https://doi.org/10.1108/ARA-09-2012-0061</w:t>
       </w:r>
     </w:p>
     <w:p>
@@ -8011,7 +8011,7 @@
         <w:t xml:space="preserve">Journal of Business Research, 131</w:t>
       </w:r>
       <w:r>
-        <w:t xml:space="preserve">, 81–91. https://doi.org/10.1016/j.jbusres.2021.03.060</w:t>
+        <w:t xml:space="preserve">, 81-91. https://doi.org/10.1016/j.jbusres.2021.03.060</w:t>
       </w:r>
     </w:p>
     <w:p>
@@ -8032,7 +8032,7 @@
         <w:t xml:space="preserve">International Journal of Trade, Economics and Finance, 10</w:t>
       </w:r>
       <w:r>
-        <w:t xml:space="preserve">(3), 84–89. https://doi.org/10.18178/ijtef.2019.10.3.645</w:t>
+        <w:t xml:space="preserve">(3), 84-89. https://doi.org/10.18178/ijtef.2019.10.3.645</w:t>
       </w:r>
     </w:p>
     <w:p>
@@ -8053,7 +8053,7 @@
         <w:t xml:space="preserve">International Small Business Journal, 21</w:t>
       </w:r>
       <w:r>
-        <w:t xml:space="preserve">(3), 249–268. https://doi.org/10.1177/0266242603021003001</w:t>
+        <w:t xml:space="preserve">(3), 249-268. https://doi.org/10.1177/0266242603021003001</w:t>
       </w:r>
     </w:p>
     <w:p>
@@ -8074,7 +8074,7 @@
         <w:t xml:space="preserve">Journal of Business Venturing, 11</w:t>
       </w:r>
       <w:r>
-        <w:t xml:space="preserve">(1), 23–40. https://doi.org/10.1016/0883-9026(95)00081-X</w:t>
+        <w:t xml:space="preserve">(1), 23-40. https://doi.org/10.1016/0883-9026(95)00081-X</w:t>
       </w:r>
     </w:p>
     <w:p>
@@ -8095,7 +8095,7 @@
         <w:t xml:space="preserve">International Business Review, 25</w:t>
       </w:r>
       <w:r>
-        <w:t xml:space="preserve">(4), 907–920. https://doi.org/10.1016/j.ibusrev.2015.12.001</w:t>
+        <w:t xml:space="preserve">(4), 907-920. https://doi.org/10.1016/j.ibusrev.2015.12.001</w:t>
       </w:r>
     </w:p>
     <w:p>
@@ -8116,7 +8116,7 @@
         <w:t xml:space="preserve">Management International Review, 57</w:t>
       </w:r>
       <w:r>
-        <w:t xml:space="preserve">(2), 153–177. https://doi.org/10.1007/s11575-016-0284-7</w:t>
+        <w:t xml:space="preserve">(2), 153-177. https://doi.org/10.1007/s11575-016-0284-7</w:t>
       </w:r>
     </w:p>
     <w:p>
@@ -8158,7 +8158,7 @@
         <w:t xml:space="preserve">Sinergie Italian Journal of Management, 35</w:t>
       </w:r>
       <w:r>
-        <w:t xml:space="preserve">(102), 49–70. https://doi.org/10.7433/s102.2017.04</w:t>
+        <w:t xml:space="preserve">(102), 49-70. https://doi.org/10.7433/s102.2017.04</w:t>
       </w:r>
     </w:p>
     <w:p>
@@ -8179,7 +8179,7 @@
         <w:t xml:space="preserve">Multinational Business Review, 17</w:t>
       </w:r>
       <w:r>
-        <w:t xml:space="preserve">(2), 69–90. https://doi.org/10.1108/1525383X200900012</w:t>
+        <w:t xml:space="preserve">(2), 69-90. https://doi.org/10.1108/1525383X200900012</w:t>
       </w:r>
     </w:p>
     <w:p>
@@ -8200,7 +8200,7 @@
         <w:t xml:space="preserve">Engineering, Construction and Architectural Management, 19</w:t>
       </w:r>
       <w:r>
-        <w:t xml:space="preserve">(2), 202–220. https://doi.org/10.1108/09699981211205849</w:t>
+        <w:t xml:space="preserve">(2), 202-220. https://doi.org/10.1108/09699981211205849</w:t>
       </w:r>
     </w:p>
     <w:p>
@@ -8221,7 +8221,7 @@
         <w:t xml:space="preserve">International Journal of Business and Globalisation, 21</w:t>
       </w:r>
       <w:r>
-        <w:t xml:space="preserve">(3), 388–404. https://doi.org/10.1504/IJBG.2018.095267</w:t>
+        <w:t xml:space="preserve">(3), 388-404. https://doi.org/10.1504/IJBG.2018.095267</w:t>
       </w:r>
     </w:p>
     <w:p>
@@ -8263,7 +8263,7 @@
         <w:t xml:space="preserve">Journal of World Business, 53</w:t>
       </w:r>
       <w:r>
-        <w:t xml:space="preserve">(5), 645–657. https://doi.org/10.1016/j.jwb.2018.03.006</w:t>
+        <w:t xml:space="preserve">(5), 645-657. https://doi.org/10.1016/j.jwb.2018.03.006</w:t>
       </w:r>
     </w:p>
     <w:p>
@@ -8305,7 +8305,7 @@
         <w:t xml:space="preserve">Journal of Business Venturing, 17</w:t>
       </w:r>
       <w:r>
-        <w:t xml:space="preserve">(6), 611–633. https://doi.org/10.1016/S0883-9026(01)00079-5</w:t>
+        <w:t xml:space="preserve">(6), 611-633. https://doi.org/10.1016/S0883-9026(01)00079-5</w:t>
       </w:r>
     </w:p>
     <w:p>
@@ -8326,7 +8326,7 @@
         <w:t xml:space="preserve">Management International Review, 47</w:t>
       </w:r>
       <w:r>
-        <w:t xml:space="preserve">(3), 349–368. https://doi.org/10.1007/s11575-007-0015-4</w:t>
+        <w:t xml:space="preserve">(3), 349-368. https://doi.org/10.1007/s11575-007-0015-4</w:t>
       </w:r>
     </w:p>
     <w:p>
@@ -8347,7 +8347,7 @@
         <w:t xml:space="preserve">Management International Review, 43</w:t>
       </w:r>
       <w:r>
-        <w:t xml:space="preserve">(1), 63–83.</w:t>
+        <w:t xml:space="preserve">(1), 63-83.</w:t>
       </w:r>
     </w:p>
     <w:p>
@@ -8368,7 +8368,7 @@
         <w:t xml:space="preserve">Oxford Bulletin of Economics and Statistics, 44</w:t>
       </w:r>
       <w:r>
-        <w:t xml:space="preserve">(1), 1–13. https://doi.org/10.1111/j.1468-0084.1982.mp44001001.x</w:t>
+        <w:t xml:space="preserve">(1), 1-13. https://doi.org/10.1111/j.1468-0084.1982.mp44001001.x</w:t>
       </w:r>
     </w:p>
     <w:p>
@@ -8389,7 +8389,7 @@
         <w:t xml:space="preserve">Journal of International Business Studies, 50</w:t>
       </w:r>
       <w:r>
-        <w:t xml:space="preserve">(2), 253–261. https://doi.org/10.1057/s41267-018-0197-4</w:t>
+        <w:t xml:space="preserve">(2), 253-261. https://doi.org/10.1057/s41267-018-0197-4</w:t>
       </w:r>
     </w:p>
     <w:p>
@@ -8410,7 +8410,7 @@
         <w:t xml:space="preserve">Journal of Business Research, 59</w:t>
       </w:r>
       <w:r>
-        <w:t xml:space="preserve">(4), 501–507. https://doi.org/10.1016/j.jbusres.2005.09.008</w:t>
+        <w:t xml:space="preserve">(4), 501-507. https://doi.org/10.1016/j.jbusres.2005.09.008</w:t>
       </w:r>
     </w:p>
     <w:p>
@@ -8431,7 +8431,7 @@
         <w:t xml:space="preserve">Multinational Business Review, 12</w:t>
       </w:r>
       <w:r>
-        <w:t xml:space="preserve">(1), 89–110. https://doi.org/10.1108/1525383X200400005</w:t>
+        <w:t xml:space="preserve">(1), 89-110. https://doi.org/10.1108/1525383X200400005</w:t>
       </w:r>
     </w:p>
     <w:p>
@@ -8452,7 +8452,7 @@
         <w:t xml:space="preserve">Asia Pacific Journal of Management, 29</w:t>
       </w:r>
       <w:r>
-        <w:t xml:space="preserve">(3), 617–642. https://doi.org/10.1007/s10490-010-9240-5</w:t>
+        <w:t xml:space="preserve">(3), 617-642. https://doi.org/10.1007/s10490-010-9240-5</w:t>
       </w:r>
     </w:p>
     <w:p>
@@ -8473,7 +8473,7 @@
         <w:t xml:space="preserve">Management International Review, 53</w:t>
       </w:r>
       <w:r>
-        <w:t xml:space="preserve">(2), 175–193. https://doi.org/10.1007/s11575-012-0135-1</w:t>
+        <w:t xml:space="preserve">(2), 175-193. https://doi.org/10.1007/s11575-012-0135-1</w:t>
       </w:r>
     </w:p>
     <w:p>
@@ -8494,7 +8494,7 @@
         <w:t xml:space="preserve">Journal of Indian Business Research, 8</w:t>
       </w:r>
       <w:r>
-        <w:t xml:space="preserve">(2), 130–149. https://doi.org/10.1108/JIBR-10-2015-0087</w:t>
+        <w:t xml:space="preserve">(2), 130-149. https://doi.org/10.1108/JIBR-10-2015-0087</w:t>
       </w:r>
     </w:p>
     <w:p>
@@ -8515,7 +8515,7 @@
         <w:t xml:space="preserve">International Journal of Emerging Markets, 13</w:t>
       </w:r>
       <w:r>
-        <w:t xml:space="preserve">(1), 95–118. https://doi.org/10.1108/IJoEM-11-2016-0298</w:t>
+        <w:t xml:space="preserve">(1), 95-118. https://doi.org/10.1108/IJoEM-11-2016-0298</w:t>
       </w:r>
     </w:p>
     <w:p>
@@ -8536,7 +8536,7 @@
         <w:t xml:space="preserve">Cuadernos de Economía y Dirección de la Empresa, 10</w:t>
       </w:r>
       <w:r>
-        <w:t xml:space="preserve">(33), 31–62.</w:t>
+        <w:t xml:space="preserve">(33), 31-62.</w:t>
       </w:r>
     </w:p>
     <w:p>
@@ -8557,7 +8557,7 @@
         <w:t xml:space="preserve">Journal of World Business, 49</w:t>
       </w:r>
       <w:r>
-        <w:t xml:space="preserve">(1), 132–142. https://doi.org/10.1016/j.jwb.2013.04.003</w:t>
+        <w:t xml:space="preserve">(1), 132-142. https://doi.org/10.1016/j.jwb.2013.04.003</w:t>
       </w:r>
     </w:p>
     <w:bookmarkEnd w:id="44"/>
@@ -8630,7 +8630,7 @@
         <w:t xml:space="preserve">Entrepreneurial Business and Economics Review, 9</w:t>
       </w:r>
       <w:r>
-        <w:t xml:space="preserve">(2), 85–104. https://doi.org/10.15678/eber.2021.090206</w:t>
+        <w:t xml:space="preserve">(2), 85-104. https://doi.org/10.15678/eber.2021.090206</w:t>
       </w:r>
     </w:p>
     <w:p>
@@ -8651,7 +8651,7 @@
         <w:t xml:space="preserve">Oeconomia Copernicana, 12</w:t>
       </w:r>
       <w:r>
-        <w:t xml:space="preserve">(1), 53–75. https://doi.org/10.24136/oc.2021.003</w:t>
+        <w:t xml:space="preserve">(1), 53-75. https://doi.org/10.24136/oc.2021.003</w:t>
       </w:r>
     </w:p>
     <w:p>
@@ -8672,7 +8672,7 @@
         <w:t xml:space="preserve">Journal of Policy Modeling, 40</w:t>
       </w:r>
       <w:r>
-        <w:t xml:space="preserve">(5), 1022–1039. https://doi.org/10.1016/j.jpolmod.2018.01.008</w:t>
+        <w:t xml:space="preserve">(5), 1022-1039. https://doi.org/10.1016/j.jpolmod.2018.01.008</w:t>
       </w:r>
     </w:p>
     <w:p>
@@ -8714,7 +8714,7 @@
         <w:t xml:space="preserve">Strategic Entrepreneurship Journal, 4</w:t>
       </w:r>
       <w:r>
-        <w:t xml:space="preserve">(2), 183–192. https://doi.org/10.1002/sej.90</w:t>
+        <w:t xml:space="preserve">(2), 183-192. https://doi.org/10.1002/sej.90</w:t>
       </w:r>
     </w:p>
     <w:p>
@@ -8735,7 +8735,7 @@
         <w:t xml:space="preserve">Industrial Marketing Management, 39</w:t>
       </w:r>
       <w:r>
-        <w:t xml:space="preserve">(7), 1103–1110. https://doi.org/10.1016/j.indmarman.2009.10.001</w:t>
+        <w:t xml:space="preserve">(7), 1103-1110. https://doi.org/10.1016/j.indmarman.2009.10.001</w:t>
       </w:r>
     </w:p>
     <w:p>
@@ -8756,7 +8756,7 @@
         <w:t xml:space="preserve">Journal of World Business, 53</w:t>
       </w:r>
       <w:r>
-        <w:t xml:space="preserve">(2), 209–221. https://doi.org/10.1016/j.jwb.2017.11.002</w:t>
+        <w:t xml:space="preserve">(2), 209-221. https://doi.org/10.1016/j.jwb.2017.11.002</w:t>
       </w:r>
     </w:p>
     <w:p>
@@ -8798,7 +8798,7 @@
         <w:t xml:space="preserve">Cross Cultural &amp; Strategic Management, 27</w:t>
       </w:r>
       <w:r>
-        <w:t xml:space="preserve">(1), 1–25. https://doi.org/10.1108/ccsm-04-2019-0075</w:t>
+        <w:t xml:space="preserve">(1), 1-25. https://doi.org/10.1108/ccsm-04-2019-0075</w:t>
       </w:r>
     </w:p>
     <w:p>
@@ -8819,15 +8819,15 @@
         <w:t xml:space="preserve">Management and Organization Review, 17</w:t>
       </w:r>
       <w:r>
-        <w:t xml:space="preserve">(1), 173–197. https://doi.org/10.1017/mor.2020.39</w:t>
-      </w:r>
-    </w:p>
-    <w:p>
-      <w:pPr>
-        <w:pStyle w:val="BodyText"/>
-      </w:pPr>
-      <w:r>
-        <w:t xml:space="preserve">Elango, B. (2012). How industry dynamics influence the internationalization–performance relationship: Evidence from technology-intensive firms.</w:t>
+        <w:t xml:space="preserve">(1), 173-197. https://doi.org/10.1017/mor.2020.39</w:t>
+      </w:r>
+    </w:p>
+    <w:p>
+      <w:pPr>
+        <w:pStyle w:val="BodyText"/>
+      </w:pPr>
+      <w:r>
+        <w:t xml:space="preserve">Elango, B. (2012). How industry dynamics influence the internationalization-performance relationship: Evidence from technology-intensive firms.</w:t>
       </w:r>
       <w:r>
         <w:t xml:space="preserve"> </w:t>
@@ -8840,7 +8840,7 @@
         <w:t xml:space="preserve">Thunderbird International Business Review, 54</w:t>
       </w:r>
       <w:r>
-        <w:t xml:space="preserve">(5), 653–665. https://doi.org/10.1002/tie.21491</w:t>
+        <w:t xml:space="preserve">(5), 653-665. https://doi.org/10.1002/tie.21491</w:t>
       </w:r>
     </w:p>
     <w:p>
@@ -8861,7 +8861,7 @@
         <w:t xml:space="preserve">Spanish Journal of Finance and Accounting, 50</w:t>
       </w:r>
       <w:r>
-        <w:t xml:space="preserve">(4), 441–468. https://doi.org/10.1080/02102412.2021.1886453</w:t>
+        <w:t xml:space="preserve">(4), 441-468. https://doi.org/10.1080/02102412.2021.1886453</w:t>
       </w:r>
     </w:p>
     <w:p>
@@ -8987,7 +8987,7 @@
         <w:t xml:space="preserve">Journal of International Management, 17</w:t>
       </w:r>
       <w:r>
-        <w:t xml:space="preserve">(1), 83–95. https://doi.org/10.1016/j.intman.2010.12.004</w:t>
+        <w:t xml:space="preserve">(1), 83-95. https://doi.org/10.1016/j.intman.2010.12.004</w:t>
       </w:r>
     </w:p>
     <w:p>
@@ -9008,7 +9008,7 @@
         <w:t xml:space="preserve">Competitiveness Review: An International Business Journal, 31</w:t>
       </w:r>
       <w:r>
-        <w:t xml:space="preserve">(4), 642–662. https://doi.org/10.1108/cr-03-2019-0028</w:t>
+        <w:t xml:space="preserve">(4), 642-662. https://doi.org/10.1108/cr-03-2019-0028</w:t>
       </w:r>
     </w:p>
     <w:p>
@@ -9029,7 +9029,7 @@
         <w:t xml:space="preserve">European Journal of Marketing, 49</w:t>
       </w:r>
       <w:r>
-        <w:t xml:space="preserve">(3/4), 420–443. https://doi.org/10.1108/ejm-06-2012-0365</w:t>
+        <w:t xml:space="preserve">(3/4), 420-443. https://doi.org/10.1108/ejm-06-2012-0365</w:t>
       </w:r>
     </w:p>
     <w:p>
@@ -9050,7 +9050,7 @@
         <w:t xml:space="preserve">Decision Science Letters, 9</w:t>
       </w:r>
       <w:r>
-        <w:t xml:space="preserve">(4), 573–580. https://doi.org/10.5267/j.dsl.2020.7.001</w:t>
+        <w:t xml:space="preserve">(4), 573-580. https://doi.org/10.5267/j.dsl.2020.7.001</w:t>
       </w:r>
     </w:p>
     <w:p>
@@ -9134,7 +9134,7 @@
         <w:t xml:space="preserve">Journal of Business Economics and Management, 16</w:t>
       </w:r>
       <w:r>
-        <w:t xml:space="preserve">(1), 52–73. https://doi.org/10.3846/16111699.2012.745812</w:t>
+        <w:t xml:space="preserve">(1), 52-73. https://doi.org/10.3846/16111699.2012.745812</w:t>
       </w:r>
     </w:p>
     <w:p>
@@ -9155,7 +9155,7 @@
         <w:t xml:space="preserve">Management International Review, 62</w:t>
       </w:r>
       <w:r>
-        <w:t xml:space="preserve">(1), 3–26. https://doi.org/10.1007/s11575-022-00464-3</w:t>
+        <w:t xml:space="preserve">(1), 3-26. https://doi.org/10.1007/s11575-022-00464-3</w:t>
       </w:r>
     </w:p>
     <w:p>
@@ -9176,7 +9176,7 @@
         <w:t xml:space="preserve">Journal of Business Research, 66</w:t>
       </w:r>
       <w:r>
-        <w:t xml:space="preserve">(12), 2500–2506. https://doi.org/10.1016/j.jbusres.2013.05.041</w:t>
+        <w:t xml:space="preserve">(12), 2500-2506. https://doi.org/10.1016/j.jbusres.2013.05.041</w:t>
       </w:r>
     </w:p>
     <w:p>
@@ -9197,7 +9197,7 @@
         <w:t xml:space="preserve">Journal of Business Research, 95</w:t>
       </w:r>
       <w:r>
-        <w:t xml:space="preserve">, 326–337. https://doi.org/10.1016/j.jbusres.2018.08.014</w:t>
+        <w:t xml:space="preserve">, 326-337. https://doi.org/10.1016/j.jbusres.2018.08.014</w:t>
       </w:r>
     </w:p>
     <w:p>
@@ -9239,7 +9239,7 @@
         <w:t xml:space="preserve">British Journal of Management, 32</w:t>
       </w:r>
       <w:r>
-        <w:t xml:space="preserve">(4), 1032–1052. https://doi.org/10.1111/1467-8551.12560</w:t>
+        <w:t xml:space="preserve">(4), 1032-1052. https://doi.org/10.1111/1467-8551.12560</w:t>
       </w:r>
     </w:p>
     <w:p>
@@ -9260,7 +9260,7 @@
         <w:t xml:space="preserve">Journal of Multinational Financial Management, 34</w:t>
       </w:r>
       <w:r>
-        <w:t xml:space="preserve">, 28–45. https://doi.org/10.1016/j.mulfin.2015.12.001</w:t>
+        <w:t xml:space="preserve">, 28-45. https://doi.org/10.1016/j.mulfin.2015.12.001</w:t>
       </w:r>
     </w:p>
     <w:p>
@@ -9289,7 +9289,7 @@
         <w:pStyle w:val="BodyText"/>
       </w:pPr>
       <w:r>
-        <w:t xml:space="preserve">Wei, S., &amp; Lin, L. (2021). The relationship between extent of internationalization and firm performance (Taiwan 1992–2017).</w:t>
+        <w:t xml:space="preserve">Wei, S., &amp; Lin, L. (2021). The relationship between extent of internationalization and firm performance (Taiwan 1992-2017).</w:t>
       </w:r>
       <w:r>
         <w:t xml:space="preserve"> </w:t>
@@ -9344,7 +9344,7 @@
         <w:t xml:space="preserve">Journal of International Marketing, 8</w:t>
       </w:r>
       <w:r>
-        <w:t xml:space="preserve">(3), 10–35. https://doi.org/10.1509/jimk.8.3.10.19635</w:t>
+        <w:t xml:space="preserve">(3), 10-35. https://doi.org/10.1509/jimk.8.3.10.19635</w:t>
       </w:r>
     </w:p>
     <w:p>
@@ -9365,7 +9365,7 @@
         <w:t xml:space="preserve">Management Decision, 47</w:t>
       </w:r>
       <w:r>
-        <w:t xml:space="preserve">(2), 308–329. https://doi.org/10.1108/00251740910938939</w:t>
+        <w:t xml:space="preserve">(2), 308-329. https://doi.org/10.1108/00251740910938939</w:t>
       </w:r>
     </w:p>
     <w:p>
@@ -9386,7 +9386,7 @@
         <w:t xml:space="preserve">Applied Economics, 50</w:t>
       </w:r>
       <w:r>
-        <w:t xml:space="preserve">(2), 135–148. https://doi.org/10.1080/00036846.2017.1321839</w:t>
+        <w:t xml:space="preserve">(2), 135-148. https://doi.org/10.1080/00036846.2017.1321839</w:t>
       </w:r>
     </w:p>
     <w:p>
@@ -9407,7 +9407,7 @@
         <w:t xml:space="preserve">Economia e Diritto del Terziario, 28</w:t>
       </w:r>
       <w:r>
-        <w:t xml:space="preserve">(1), 5–22.</w:t>
+        <w:t xml:space="preserve">(1), 5-22.</w:t>
       </w:r>
     </w:p>
     <w:p>
@@ -9428,7 +9428,7 @@
         <w:t xml:space="preserve">International Entrepreneurship and Management Journal, 10</w:t>
       </w:r>
       <w:r>
-        <w:t xml:space="preserve">(1), 1–15. https://doi.org/10.1007/s11365-011-0218-8</w:t>
+        <w:t xml:space="preserve">(1), 1-15. https://doi.org/10.1007/s11365-011-0218-8</w:t>
       </w:r>
     </w:p>
     <w:bookmarkEnd w:id="45"/>
@@ -9503,7 +9503,7 @@
         <w:t xml:space="preserve">Global Strategy Journal, 10</w:t>
       </w:r>
       <w:r>
-        <w:t xml:space="preserve">(2), 239–250. https://doi.org/10.1002/gsj.1383</w:t>
+        <w:t xml:space="preserve">(2), 239-250. https://doi.org/10.1002/gsj.1383</w:t>
       </w:r>
     </w:p>
     <w:bookmarkEnd w:id="46"/>
@@ -9542,7 +9542,7 @@
         <w:t xml:space="preserve">Journal of Management, 37</w:t>
       </w:r>
       <w:r>
-        <w:t xml:space="preserve">(1), 5–38. https://doi.org/10.1177/0149206310370708</w:t>
+        <w:t xml:space="preserve">(1), 5-38. https://doi.org/10.1177/0149206310370708</w:t>
       </w:r>
     </w:p>
     <w:p>
@@ -9566,7 +9566,7 @@
         <w:t xml:space="preserve"> </w:t>
       </w:r>
       <w:r>
-        <w:t xml:space="preserve">(pp. 49–62). Croom Helm.</w:t>
+        <w:t xml:space="preserve">(pp. 49-62). Croom Helm.</w:t>
       </w:r>
     </w:p>
     <w:p>
@@ -9611,7 +9611,7 @@
         <w:t xml:space="preserve">World Development, 23</w:t>
       </w:r>
       <w:r>
-        <w:t xml:space="preserve">(9), 1615–1632. https://doi.org/10.1016/0305-750X(95)00065-K</w:t>
+        <w:t xml:space="preserve">(9), 1615-1632. https://doi.org/10.1016/0305-750X(95)00065-K</w:t>
       </w:r>
     </w:p>
     <w:p>
@@ -9632,7 +9632,7 @@
         <w:t xml:space="preserve">Journal of Human Resources, 50</w:t>
       </w:r>
       <w:r>
-        <w:t xml:space="preserve">(2), 317–372. https://doi.org/10.3368/jhr.50.2.317</w:t>
+        <w:t xml:space="preserve">(2), 317-372. https://doi.org/10.3368/jhr.50.2.317</w:t>
       </w:r>
     </w:p>
     <w:p>
@@ -9677,7 +9677,7 @@
         <w:t xml:space="preserve">Global Strategy Journal, 2</w:t>
       </w:r>
       <w:r>
-        <w:t xml:space="preserve">(4), 318–331. https://doi.org/10.1111/j.2042-5805.2012.01043.x</w:t>
+        <w:t xml:space="preserve">(4), 318-331. https://doi.org/10.1111/j.2042-5805.2012.01043.x</w:t>
       </w:r>
     </w:p>
     <w:p>
@@ -9746,7 +9746,7 @@
         <w:t xml:space="preserve">Academy of Management Review, 32</w:t>
       </w:r>
       <w:r>
-        <w:t xml:space="preserve">(2), 334–343. https://doi.org/10.5465/amr.2007.24345254</w:t>
+        <w:t xml:space="preserve">(2), 334-343. https://doi.org/10.5465/amr.2007.24345254</w:t>
       </w:r>
     </w:p>
     <w:p>
@@ -9767,7 +9767,7 @@
         <w:t xml:space="preserve">Academy of Management Review, 9</w:t>
       </w:r>
       <w:r>
-        <w:t xml:space="preserve">(2), 193–206. https://doi.org/10.5465/amr.1984.4277628</w:t>
+        <w:t xml:space="preserve">(2), 193-206. https://doi.org/10.5465/amr.1984.4277628</w:t>
       </w:r>
     </w:p>
     <w:p>
@@ -9809,7 +9809,7 @@
         <w:t xml:space="preserve">American Economic Review, 94</w:t>
       </w:r>
       <w:r>
-        <w:t xml:space="preserve">(1), 300–316. https://doi.org/10.1257/000282804322970814</w:t>
+        <w:t xml:space="preserve">(1), 300-316. https://doi.org/10.1257/000282804322970814</w:t>
       </w:r>
     </w:p>
     <w:p>
@@ -9830,7 +9830,7 @@
         <w:t xml:space="preserve">Journal of Industrial Economics, 27</w:t>
       </w:r>
       <w:r>
-        <w:t xml:space="preserve">(4), 359–369. https://doi.org/10.2307/2097958</w:t>
+        <w:t xml:space="preserve">(4), 359-369. https://doi.org/10.2307/2097958</w:t>
       </w:r>
     </w:p>
     <w:p>
@@ -9872,7 +9872,7 @@
         <w:t xml:space="preserve">Review of Managerial Science, 16</w:t>
       </w:r>
       <w:r>
-        <w:t xml:space="preserve">(8), 2577–2595. https://doi.org/10.1007/s11846-022-00588-8</w:t>
+        <w:t xml:space="preserve">(8), 2577-2595. https://doi.org/10.1007/s11846-022-00588-8</w:t>
       </w:r>
     </w:p>
     <w:p>
@@ -9893,7 +9893,7 @@
         <w:t xml:space="preserve">Biometrics, 33</w:t>
       </w:r>
       <w:r>
-        <w:t xml:space="preserve">(1), 159–174. https://doi.org/10.2307/2529310</w:t>
+        <w:t xml:space="preserve">(1), 159-174. https://doi.org/10.2307/2529310</w:t>
       </w:r>
     </w:p>
     <w:p>
@@ -9914,7 +9914,7 @@
         <w:t xml:space="preserve">Journal of International Business Studies, 39</w:t>
       </w:r>
       <w:r>
-        <w:t xml:space="preserve">(5), 920–936. https://doi.org/10.1057/palgrave.jibs.8400377</w:t>
+        <w:t xml:space="preserve">(5), 920-936. https://doi.org/10.1057/palgrave.jibs.8400377</w:t>
       </w:r>
     </w:p>
     <w:p>
@@ -9935,7 +9935,7 @@
         <w:t xml:space="preserve">Journal of Applied Psychology, 90</w:t>
       </w:r>
       <w:r>
-        <w:t xml:space="preserve">(1), 175–181. https://doi.org/10.1037/0021-9010.90.1.175</w:t>
+        <w:t xml:space="preserve">(1), 175-181. https://doi.org/10.1037/0021-9010.90.1.175</w:t>
       </w:r>
     </w:p>
     <w:p>
@@ -10007,7 +10007,7 @@
         <w:t xml:space="preserve"> </w:t>
       </w:r>
       <w:r>
-        <w:t xml:space="preserve">(pp. 231–244). Sage.</w:t>
+        <w:t xml:space="preserve">(pp. 231-244). Sage.</w:t>
       </w:r>
     </w:p>
     <w:p>
@@ -10028,7 +10028,7 @@
         <w:t xml:space="preserve">European Economic Review, 45</w:t>
       </w:r>
       <w:r>
-        <w:t xml:space="preserve">(4–6), 827–838. https://doi.org/10.1016/S0014-2921(01)00125-8</w:t>
+        <w:t xml:space="preserve">(4-6), 827-838. https://doi.org/10.1016/S0014-2921(01)00125-8</w:t>
       </w:r>
     </w:p>
     <w:p>
@@ -10073,7 +10073,7 @@
         <w:t xml:space="preserve">Journal of Human Resources, 50</w:t>
       </w:r>
       <w:r>
-        <w:t xml:space="preserve">(2), 301–316. https://doi.org/10.3368/jhr.50.2.301</w:t>
+        <w:t xml:space="preserve">(2), 301-316. https://doi.org/10.3368/jhr.50.2.301</w:t>
       </w:r>
     </w:p>
     <w:p>
@@ -10094,7 +10094,7 @@
         <w:t xml:space="preserve">Research Synthesis Methods, 5</w:t>
       </w:r>
       <w:r>
-        <w:t xml:space="preserve">(1), 60–78. https://doi.org/10.1002/jrsm.1095</w:t>
+        <w:t xml:space="preserve">(1), 60-78. https://doi.org/10.1002/jrsm.1095</w:t>
       </w:r>
     </w:p>
     <w:p>
@@ -10115,7 +10115,7 @@
         <w:t xml:space="preserve">Statistics in Medicine, 27</w:t>
       </w:r>
       <w:r>
-        <w:t xml:space="preserve">(5), 625–650. https://doi.org/10.1002/sim.2982</w:t>
+        <w:t xml:space="preserve">(5), 625-650. https://doi.org/10.1002/sim.2982</w:t>
       </w:r>
     </w:p>
     <w:p>
@@ -10136,7 +10136,7 @@
         <w:t xml:space="preserve">Journal of Statistical Software, 36</w:t>
       </w:r>
       <w:r>
-        <w:t xml:space="preserve">(3), 1–48. https://doi.org/10.18637/jss.v036.i03</w:t>
+        <w:t xml:space="preserve">(3), 1-48. https://doi.org/10.18637/jss.v036.i03</w:t>
       </w:r>
     </w:p>
     <w:p>
@@ -10267,7 +10267,7 @@
         <w:t xml:space="preserve">2</w:t>
       </w:r>
       <w:r>
-        <w:t xml:space="preserve">(1), 111–115.</w:t>
+        <w:t xml:space="preserve">(1), 111-115.</w:t>
       </w:r>
       <w:r>
         <w:t xml:space="preserve"> </w:t>
@@ -10342,7 +10342,7 @@
           <w:iCs/>
           <w:i/>
         </w:rPr>
-        <w:t xml:space="preserve">Institutional context, digital adoption, and the internationalization–performance relationship: A three-level meta-analysis</w:t>
+        <w:t xml:space="preserve">Institutional context, digital adoption, and the internationalization-performance relationship: A three-level meta-analysis</w:t>
       </w:r>
       <w:r>
         <w:t xml:space="preserve"> </w:t>
@@ -10436,7 +10436,7 @@
           <w:iCs/>
           <w:i/>
         </w:rPr>
-        <w:t xml:space="preserve">Revisiting the internationalisation–performance relationship in an emerging market: The roles of technological capability and foundational digital adoption</w:t>
+        <w:t xml:space="preserve">Revisiting the internationalisation-performance relationship in an emerging market: The roles of technological capability and foundational digital adoption</w:t>
       </w:r>
       <w:r>
         <w:t xml:space="preserve"> </w:t>
@@ -10546,7 +10546,7 @@
         <w:t xml:space="preserve">39</w:t>
       </w:r>
       <w:r>
-        <w:t xml:space="preserve">(2), 287–291.</w:t>
+        <w:t xml:space="preserve">(2), 287-291.</w:t>
       </w:r>
       <w:r>
         <w:t xml:space="preserve"> </w:t>
@@ -10574,7 +10574,7 @@
         <w:pStyle w:val="FirstParagraph"/>
       </w:pPr>
       <w:r>
-        <w:t xml:space="preserve">Arte, L., &amp; Larimo, J. (2022). Moderating influence of psychic distance on the international diversification–performance relationship: Insights from a meta-analysis.</w:t>
+        <w:t xml:space="preserve">Arte, L., &amp; Larimo, J. (2022). Moderating influence of psychic distance on the international diversification-performance relationship: Insights from a meta-analysis.</w:t>
       </w:r>
       <w:r>
         <w:t xml:space="preserve"> </w:t>
@@ -10587,7 +10587,7 @@
         <w:t xml:space="preserve">Journal of Business Research, 139</w:t>
       </w:r>
       <w:r>
-        <w:t xml:space="preserve">, 230–245. https://doi.org/10.1016/j.jbusres.2021.09.060</w:t>
+        <w:t xml:space="preserve">, 230-245. https://doi.org/10.1016/j.jbusres.2021.09.060</w:t>
       </w:r>
     </w:p>
     <w:p>
@@ -10608,7 +10608,7 @@
         <w:t xml:space="preserve">Economic Development and Cultural Change, 59</w:t>
       </w:r>
       <w:r>
-        <w:t xml:space="preserve">(3), 609–647. https://doi.org/10.1086/658349</w:t>
+        <w:t xml:space="preserve">(3), 609-647. https://doi.org/10.1086/658349</w:t>
       </w:r>
     </w:p>
     <w:p>
@@ -10660,7 +10660,7 @@
         <w:t xml:space="preserve">Econometrica, 47</w:t>
       </w:r>
       <w:r>
-        <w:t xml:space="preserve">(5), 1287–1294. https://doi.org/10.2307/1911963</w:t>
+        <w:t xml:space="preserve">(5), 1287-1294. https://doi.org/10.2307/1911963</w:t>
       </w:r>
     </w:p>
     <w:p>
@@ -10705,7 +10705,7 @@
         <w:t xml:space="preserve">BMJ, 327</w:t>
       </w:r>
       <w:r>
-        <w:t xml:space="preserve">(7414), 557–560. https://doi.org/10.1136/bmj.327.7414.557</w:t>
+        <w:t xml:space="preserve">(7414), 557-560. https://doi.org/10.1136/bmj.327.7414.557</w:t>
       </w:r>
     </w:p>
     <w:p>
@@ -10726,7 +10726,7 @@
         <w:t xml:space="preserve">Hague Journal on the Rule of Law, 3</w:t>
       </w:r>
       <w:r>
-        <w:t xml:space="preserve">(2), 220–246. https://doi.org/10.1017/S1876404511200046</w:t>
+        <w:t xml:space="preserve">(2), 220-246. https://doi.org/10.1017/S1876404511200046</w:t>
       </w:r>
     </w:p>
     <w:bookmarkEnd w:id="49"/>
@@ -10757,7 +10757,7 @@
         <w:t xml:space="preserve">Academy of Management Review, 28</w:t>
       </w:r>
       <w:r>
-        <w:t xml:space="preserve">(2), 275–296. https://doi.org/10.5465/amr.2003.9416341</w:t>
+        <w:t xml:space="preserve">(2), 275-296. https://doi.org/10.5465/amr.2003.9416341</w:t>
       </w:r>
     </w:p>
     <w:p>
@@ -10778,7 +10778,7 @@
         <w:t xml:space="preserve">Research Policy, 15</w:t>
       </w:r>
       <w:r>
-        <w:t xml:space="preserve">(6), 285–305. https://doi.org/10.1016/0048-7333(86)90027-2</w:t>
+        <w:t xml:space="preserve">(6), 285-305. https://doi.org/10.1016/0048-7333(86)90027-2</w:t>
       </w:r>
     </w:p>
     <w:bookmarkEnd w:id="50"/>

</xml_diff>

<commit_message>
build(dist): rebuild references PDF+Word after APA fixes
https://claude.ai/code/session_01TqgqRfCDLY39798jcQXCr9
</commit_message>
<xml_diff>
--- a/dist/downloads/04_references_apa7.docx
+++ b/dist/downloads/04_references_apa7.docx
@@ -3859,782 +3859,799 @@
         <w:pStyle w:val="BodyText"/>
       </w:pPr>
       <w:r>
-        <w:t xml:space="preserve">Author, C., &amp; Author, C. B. (2026). Self-citation blinded for anonymous peer review.</w:t>
-      </w:r>
-      <w:r>
-        <w:t xml:space="preserve"> </w:t>
-      </w:r>
-      <w:r>
-        <w:rPr>
-          <w:iCs/>
-          <w:i/>
-        </w:rPr>
-        <w:t xml:space="preserve">Management International Review, under review</w:t>
+        <w:t xml:space="preserve">Mar, K. S., Đỗ, T. H., &amp; Phan, A. T. (2026). Institutional completeness and the internationalization-performance relationship: Capability ceiling and dual substitution evidence from Singapore.</w:t>
+      </w:r>
+      <w:r>
+        <w:t xml:space="preserve"> </w:t>
+      </w:r>
+      <w:r>
+        <w:rPr>
+          <w:iCs/>
+          <w:i/>
+        </w:rPr>
+        <w:t xml:space="preserve">Management International Review</w:t>
+      </w:r>
+      <w:r>
+        <w:t xml:space="preserve"> </w:t>
+      </w:r>
+      <w:r>
+        <w:t xml:space="preserve">(under review).</w:t>
+      </w:r>
+    </w:p>
+    <w:p>
+      <w:pPr>
+        <w:pStyle w:val="BodyText"/>
+      </w:pPr>
+      <w:r>
+        <w:t xml:space="preserve">Banerjee, A. V., &amp; Duflo, E. (2014). Do firms want to borrow more? Testing credit constraints using a directed lending program.</w:t>
+      </w:r>
+      <w:r>
+        <w:t xml:space="preserve"> </w:t>
+      </w:r>
+      <w:r>
+        <w:rPr>
+          <w:iCs/>
+          <w:i/>
+        </w:rPr>
+        <w:t xml:space="preserve">Review of Economic Studies, 81</w:t>
+      </w:r>
+      <w:r>
+        <w:t xml:space="preserve">(2), 572-607. https://doi.org/10.1093/restud/rdt046</w:t>
+      </w:r>
+    </w:p>
+    <w:p>
+      <w:pPr>
+        <w:pStyle w:val="BodyText"/>
+      </w:pPr>
+      <w:r>
+        <w:t xml:space="preserve">Barney, J. (1991). Firm resources and sustained competitive advantage.</w:t>
+      </w:r>
+      <w:r>
+        <w:t xml:space="preserve"> </w:t>
+      </w:r>
+      <w:r>
+        <w:rPr>
+          <w:iCs/>
+          <w:i/>
+        </w:rPr>
+        <w:t xml:space="preserve">Journal of Management, 17</w:t>
+      </w:r>
+      <w:r>
+        <w:t xml:space="preserve">(1), 99-120. https://doi.org/10.1177/014920639101700108</w:t>
+      </w:r>
+    </w:p>
+    <w:p>
+      <w:pPr>
+        <w:pStyle w:val="BodyText"/>
+      </w:pPr>
+      <w:r>
+        <w:t xml:space="preserve">Bausch, A., &amp; Krist, M. (2007). The effect of context-related moderators on the internationalization-performance relationship: Evidence from meta-analysis.</w:t>
+      </w:r>
+      <w:r>
+        <w:t xml:space="preserve"> </w:t>
+      </w:r>
+      <w:r>
+        <w:rPr>
+          <w:iCs/>
+          <w:i/>
+        </w:rPr>
+        <w:t xml:space="preserve">Management International Review, 47</w:t>
+      </w:r>
+      <w:r>
+        <w:t xml:space="preserve">(3), 319-347. https://doi.org/10.1007/s11575-007-0019-z</w:t>
+      </w:r>
+    </w:p>
+    <w:p>
+      <w:pPr>
+        <w:pStyle w:val="BodyText"/>
+      </w:pPr>
+      <w:r>
+        <w:t xml:space="preserve">Begg, C. B., &amp; Mazumdar, M. (1994). Operating characteristics of a rank correlation test for publication bias.</w:t>
+      </w:r>
+      <w:r>
+        <w:t xml:space="preserve"> </w:t>
+      </w:r>
+      <w:r>
+        <w:rPr>
+          <w:iCs/>
+          <w:i/>
+        </w:rPr>
+        <w:t xml:space="preserve">Biometrics, 50</w:t>
+      </w:r>
+      <w:r>
+        <w:t xml:space="preserve">(4), 1088-1101. https://doi.org/10.2307/2533446</w:t>
+      </w:r>
+    </w:p>
+    <w:p>
+      <w:pPr>
+        <w:pStyle w:val="BodyText"/>
+      </w:pPr>
+      <w:r>
+        <w:t xml:space="preserve">Bertram, G. (2006). Introduction: The MIRAB model in the twenty-first century.</w:t>
+      </w:r>
+      <w:r>
+        <w:t xml:space="preserve"> </w:t>
+      </w:r>
+      <w:r>
+        <w:rPr>
+          <w:iCs/>
+          <w:i/>
+        </w:rPr>
+        <w:t xml:space="preserve">Asia Pacific Viewpoint, 47</w:t>
+      </w:r>
+      <w:r>
+        <w:t xml:space="preserve">(1), 1-13. https://doi.org/10.1111/j.1467-8373.2006.00297.x</w:t>
+      </w:r>
+    </w:p>
+    <w:p>
+      <w:pPr>
+        <w:pStyle w:val="BodyText"/>
+      </w:pPr>
+      <w:r>
+        <w:t xml:space="preserve">Brynjolfsson, E., &amp; McAfee, A. (2014).</w:t>
+      </w:r>
+      <w:r>
+        <w:t xml:space="preserve"> </w:t>
+      </w:r>
+      <w:r>
+        <w:rPr>
+          <w:iCs/>
+          <w:i/>
+        </w:rPr>
+        <w:t xml:space="preserve">The second machine age: Work, progress, and prosperity in a time of brilliant technologies</w:t>
+      </w:r>
+      <w:r>
+        <w:t xml:space="preserve">. W. W. Norton &amp; Company.</w:t>
+      </w:r>
+    </w:p>
+    <w:p>
+      <w:pPr>
+        <w:pStyle w:val="BodyText"/>
+      </w:pPr>
+      <w:r>
+        <w:t xml:space="preserve">Brynjolfsson, E., Rock, D., &amp; Syverson, C. (2021). The productivity J-curve: How intangibles complement general purpose technologies.</w:t>
+      </w:r>
+      <w:r>
+        <w:t xml:space="preserve"> </w:t>
+      </w:r>
+      <w:r>
+        <w:rPr>
+          <w:iCs/>
+          <w:i/>
+        </w:rPr>
+        <w:t xml:space="preserve">American Economic Journal: Macroeconomics, 13</w:t>
+      </w:r>
+      <w:r>
+        <w:t xml:space="preserve">(1), 333-372. https://doi.org/10.1257/mac.20180386</w:t>
+      </w:r>
+    </w:p>
+    <w:p>
+      <w:pPr>
+        <w:pStyle w:val="BodyText"/>
+      </w:pPr>
+      <w:r>
+        <w:t xml:space="preserve">Buckley, P. J., Clegg, L. J., Cross, A. R., Liu, X., Voss, H., &amp; Zheng, P. (2007). The determinants of Chinese outward foreign direct investment.</w:t>
+      </w:r>
+      <w:r>
+        <w:t xml:space="preserve"> </w:t>
+      </w:r>
+      <w:r>
+        <w:rPr>
+          <w:iCs/>
+          <w:i/>
+        </w:rPr>
+        <w:t xml:space="preserve">Journal of International Business Studies, 38</w:t>
+      </w:r>
+      <w:r>
+        <w:t xml:space="preserve">(4), 499-518. https://doi.org/10.1057/palgrave.jibs.8400277</w:t>
+      </w:r>
+    </w:p>
+    <w:p>
+      <w:pPr>
+        <w:pStyle w:val="BodyText"/>
+      </w:pPr>
+      <w:r>
+        <w:t xml:space="preserve">Cohen, W. M., &amp; Levinthal, D. A. (1990). Absorptive capacity: A new perspective on learning and innovation.</w:t>
+      </w:r>
+      <w:r>
+        <w:t xml:space="preserve"> </w:t>
+      </w:r>
+      <w:r>
+        <w:rPr>
+          <w:iCs/>
+          <w:i/>
+        </w:rPr>
+        <w:t xml:space="preserve">Administrative Science Quarterly, 35</w:t>
+      </w:r>
+      <w:r>
+        <w:t xml:space="preserve">(1), 128-152. https://doi.org/10.2307/2393553</w:t>
+      </w:r>
+    </w:p>
+    <w:p>
+      <w:pPr>
+        <w:pStyle w:val="BodyText"/>
+      </w:pPr>
+      <w:r>
+        <w:t xml:space="preserve">Combs, J. G., Crook, T. R., &amp; Shook, C. L. (2005). The dimensionality of organizational performance and its implications for strategic management research. In D. J. Ketchen &amp; D. D. Bergh (Eds.),</w:t>
+      </w:r>
+      <w:r>
+        <w:t xml:space="preserve"> </w:t>
+      </w:r>
+      <w:r>
+        <w:rPr>
+          <w:iCs/>
+          <w:i/>
+        </w:rPr>
+        <w:t xml:space="preserve">Research methodology in strategy and management</w:t>
+      </w:r>
+      <w:r>
+        <w:t xml:space="preserve"> </w:t>
+      </w:r>
+      <w:r>
+        <w:t xml:space="preserve">(Vol. 2, pp. 259-286). Emerald.</w:t>
+      </w:r>
+    </w:p>
+    <w:p>
+      <w:pPr>
+        <w:pStyle w:val="BodyText"/>
+      </w:pPr>
+      <w:r>
+        <w:t xml:space="preserve">Cusolito, A. P., &amp; Maloney, W. F. (2018).</w:t>
+      </w:r>
+      <w:r>
+        <w:t xml:space="preserve"> </w:t>
+      </w:r>
+      <w:r>
+        <w:rPr>
+          <w:iCs/>
+          <w:i/>
+        </w:rPr>
+        <w:t xml:space="preserve">Productivity revisited: Shifting paradigms in analysis and policy</w:t>
+      </w:r>
+      <w:r>
+        <w:t xml:space="preserve">. World Bank. https://doi.org/10.1596/978-1-4648-1219-6</w:t>
+      </w:r>
+    </w:p>
+    <w:p>
+      <w:pPr>
+        <w:pStyle w:val="BodyText"/>
+      </w:pPr>
+      <w:r>
+        <w:t xml:space="preserve">Demir, B., &amp; Javorcik, B. (2018). Don’t throw in the towel, throw in trade credit!</w:t>
+      </w:r>
+      <w:r>
+        <w:t xml:space="preserve"> </w:t>
+      </w:r>
+      <w:r>
+        <w:rPr>
+          <w:iCs/>
+          <w:i/>
+        </w:rPr>
+        <w:t xml:space="preserve">Journal of International Economics, 111</w:t>
+      </w:r>
+      <w:r>
+        <w:t xml:space="preserve">, 177-189. https://doi.org/10.1016/j.jinteco.2018.01.008</w:t>
+      </w:r>
+    </w:p>
+    <w:p>
+      <w:pPr>
+        <w:pStyle w:val="BodyText"/>
+      </w:pPr>
+      <w:r>
+        <w:t xml:space="preserve">Duval, S., &amp; Tweedie, R. (2000). Trim and fill: A simple funnel-plot-based method of testing and adjusting for publication bias in meta-analysis.</w:t>
+      </w:r>
+      <w:r>
+        <w:t xml:space="preserve"> </w:t>
+      </w:r>
+      <w:r>
+        <w:rPr>
+          <w:iCs/>
+          <w:i/>
+        </w:rPr>
+        <w:t xml:space="preserve">Biometrics, 56</w:t>
+      </w:r>
+      <w:r>
+        <w:t xml:space="preserve">(2), 455-463. https://doi.org/10.1111/j.0006-341X.2000.00455.x</w:t>
+      </w:r>
+    </w:p>
+    <w:p>
+      <w:pPr>
+        <w:pStyle w:val="BodyText"/>
+      </w:pPr>
+      <w:r>
+        <w:t xml:space="preserve">Eden, L., &amp; Nielsen, B. B. (2020). Research methods in international business: The challenge of complexity.</w:t>
+      </w:r>
+      <w:r>
+        <w:t xml:space="preserve"> </w:t>
+      </w:r>
+      <w:r>
+        <w:rPr>
+          <w:iCs/>
+          <w:i/>
+        </w:rPr>
+        <w:t xml:space="preserve">Journal of International Business Studies, 51</w:t>
+      </w:r>
+      <w:r>
+        <w:t xml:space="preserve">(9), 1609-1620. https://doi.org/10.1057/s41267-020-00374-2</w:t>
+      </w:r>
+    </w:p>
+    <w:p>
+      <w:pPr>
+        <w:pStyle w:val="BodyText"/>
+      </w:pPr>
+      <w:r>
+        <w:t xml:space="preserve">Egger, M., Davey Smith, G., Schneider, M., &amp; Minder, C. (1997). Bias in meta-analysis detected by a simple, graphical test.</w:t>
+      </w:r>
+      <w:r>
+        <w:t xml:space="preserve"> </w:t>
+      </w:r>
+      <w:r>
+        <w:rPr>
+          <w:iCs/>
+          <w:i/>
+        </w:rPr>
+        <w:t xml:space="preserve">British Medical Journal, 315</w:t>
+      </w:r>
+      <w:r>
+        <w:t xml:space="preserve">(7109), 629-634. https://doi.org/10.1136/bmj.315.7109.629</w:t>
+      </w:r>
+    </w:p>
+    <w:p>
+      <w:pPr>
+        <w:pStyle w:val="BodyText"/>
+      </w:pPr>
+      <w:r>
+        <w:t xml:space="preserve">Haans, R. F. J., Pieters, C., &amp; He, Z.-L. (2016). Thinking about U: Theorizing and testing U- and inverted U-shaped relationships in strategy research.</w:t>
+      </w:r>
+      <w:r>
+        <w:t xml:space="preserve"> </w:t>
+      </w:r>
+      <w:r>
+        <w:rPr>
+          <w:iCs/>
+          <w:i/>
+        </w:rPr>
+        <w:t xml:space="preserve">Strategic Management Journal, 37</w:t>
+      </w:r>
+      <w:r>
+        <w:t xml:space="preserve">(7), 1177-1195. https://doi.org/10.1002/smj.2399</w:t>
+      </w:r>
+    </w:p>
+    <w:p>
+      <w:pPr>
+        <w:pStyle w:val="BodyText"/>
+      </w:pPr>
+      <w:r>
+        <w:t xml:space="preserve">Hall, P. A., &amp; Soskice, D. (2001).</w:t>
+      </w:r>
+      <w:r>
+        <w:t xml:space="preserve"> </w:t>
+      </w:r>
+      <w:r>
+        <w:rPr>
+          <w:iCs/>
+          <w:i/>
+        </w:rPr>
+        <w:t xml:space="preserve">Varieties of capitalism: The institutional foundations of comparative advantage</w:t>
+      </w:r>
+      <w:r>
+        <w:t xml:space="preserve">. Oxford University Press. https://doi.org/10.1093/0199247757.001.0001</w:t>
+      </w:r>
+    </w:p>
+    <w:p>
+      <w:pPr>
+        <w:pStyle w:val="BodyText"/>
+      </w:pPr>
+      <w:r>
+        <w:t xml:space="preserve">Hennart, J.-F. (2007). The theoretical rationale for a multinationality-performance relationship.</w:t>
+      </w:r>
+      <w:r>
+        <w:t xml:space="preserve"> </w:t>
+      </w:r>
+      <w:r>
+        <w:rPr>
+          <w:iCs/>
+          <w:i/>
+        </w:rPr>
+        <w:t xml:space="preserve">Management International Review, 47</w:t>
+      </w:r>
+      <w:r>
+        <w:t xml:space="preserve">(3), 423-452. https://doi.org/10.1007/s11575-007-0022-4</w:t>
+      </w:r>
+    </w:p>
+    <w:p>
+      <w:pPr>
+        <w:pStyle w:val="BodyText"/>
+      </w:pPr>
+      <w:r>
+        <w:t xml:space="preserve">Hitt, M. A., Hoskisson, R. E., &amp; Kim, H. (1997). International diversification: Effects on innovation and firm performance in product-diversified firms.</w:t>
+      </w:r>
+      <w:r>
+        <w:t xml:space="preserve"> </w:t>
+      </w:r>
+      <w:r>
+        <w:rPr>
+          <w:iCs/>
+          <w:i/>
+        </w:rPr>
+        <w:t xml:space="preserve">Academy of Management Journal, 40</w:t>
+      </w:r>
+      <w:r>
+        <w:t xml:space="preserve">(4), 767-798. https://doi.org/10.2307/256948</w:t>
+      </w:r>
+    </w:p>
+    <w:p>
+      <w:pPr>
+        <w:pStyle w:val="BodyText"/>
+      </w:pPr>
+      <w:r>
+        <w:t xml:space="preserve">Hsieh, C.-T., &amp; Klenow, P. J. (2009). Misallocation and manufacturing TFP in China and India.</w:t>
+      </w:r>
+      <w:r>
+        <w:t xml:space="preserve"> </w:t>
+      </w:r>
+      <w:r>
+        <w:rPr>
+          <w:iCs/>
+          <w:i/>
+        </w:rPr>
+        <w:t xml:space="preserve">Quarterly Journal of Economics, 124</w:t>
+      </w:r>
+      <w:r>
+        <w:t xml:space="preserve">(4), 1403-1448. https://doi.org/10.1162/qjec.2009.124.4.1403</w:t>
+      </w:r>
+    </w:p>
+    <w:p>
+      <w:pPr>
+        <w:pStyle w:val="BodyText"/>
+      </w:pPr>
+      <w:r>
+        <w:t xml:space="preserve">Hsu, M.-L., &amp; Boggs, D. J. (2003). Internationalization and performance: Traditional measures and their decomposition.</w:t>
+      </w:r>
+      <w:r>
+        <w:t xml:space="preserve"> </w:t>
+      </w:r>
+      <w:r>
+        <w:rPr>
+          <w:iCs/>
+          <w:i/>
+        </w:rPr>
+        <w:t xml:space="preserve">Multinational Business Review, 11</w:t>
+      </w:r>
+      <w:r>
+        <w:t xml:space="preserve">(3), 23-49. https://doi.org/10.1108/1525383X200300015</w:t>
+      </w:r>
+    </w:p>
+    <w:p>
+      <w:pPr>
+        <w:pStyle w:val="BodyText"/>
+      </w:pPr>
+      <w:r>
+        <w:t xml:space="preserve">Hsu, W. T., Chen, H. L., &amp; Cheng, C. Y. (2013). Internationalization and firm performance of SMEs: The moderating effects of CEO attributes.</w:t>
+      </w:r>
+      <w:r>
+        <w:t xml:space="preserve"> </w:t>
+      </w:r>
+      <w:r>
+        <w:rPr>
+          <w:iCs/>
+          <w:i/>
+        </w:rPr>
+        <w:t xml:space="preserve">Journal of World Business, 48</w:t>
+      </w:r>
+      <w:r>
+        <w:t xml:space="preserve">(1), 1-12. https://doi.org/10.1016/j.jwb.2012.06.001</w:t>
+      </w:r>
+    </w:p>
+    <w:p>
+      <w:pPr>
+        <w:pStyle w:val="BodyText"/>
+      </w:pPr>
+      <w:r>
+        <w:t xml:space="preserve">Johanson, J., &amp; Vahlne, J.-E. (1977). The internationalization process of the firm — A model of knowledge development and increasing foreign market commitments.</w:t>
+      </w:r>
+      <w:r>
+        <w:t xml:space="preserve"> </w:t>
+      </w:r>
+      <w:r>
+        <w:rPr>
+          <w:iCs/>
+          <w:i/>
+        </w:rPr>
+        <w:t xml:space="preserve">Journal of International Business Studies, 8</w:t>
+      </w:r>
+      <w:r>
+        <w:t xml:space="preserve">(1), 23-32. https://doi.org/10.1057/palgrave.jibs.8490676</w:t>
+      </w:r>
+    </w:p>
+    <w:p>
+      <w:pPr>
+        <w:pStyle w:val="BodyText"/>
+      </w:pPr>
+      <w:r>
+        <w:t xml:space="preserve">Kano, L., Tsang, E. W. K., &amp; Yeung, H. W.-C. (2020). Global value chains: A review of the multi-disciplinary literature.</w:t>
+      </w:r>
+      <w:r>
+        <w:t xml:space="preserve"> </w:t>
+      </w:r>
+      <w:r>
+        <w:rPr>
+          <w:iCs/>
+          <w:i/>
+        </w:rPr>
+        <w:t xml:space="preserve">Journal of International Business Studies, 51</w:t>
+      </w:r>
+      <w:r>
+        <w:t xml:space="preserve">(4), 577-622. https://doi.org/10.1057/s41267-020-00304-2</w:t>
+      </w:r>
+    </w:p>
+    <w:p>
+      <w:pPr>
+        <w:pStyle w:val="BodyText"/>
+      </w:pPr>
+      <w:r>
+        <w:t xml:space="preserve">Karna, A., Richter, A., &amp; Riesenkampff, E. (2016). Revisiting the role of the environment in the capabilities-financial performance relationship: A meta-analysis.</w:t>
+      </w:r>
+      <w:r>
+        <w:t xml:space="preserve"> </w:t>
+      </w:r>
+      <w:r>
+        <w:rPr>
+          <w:iCs/>
+          <w:i/>
+        </w:rPr>
+        <w:t xml:space="preserve">Strategic Management Journal, 37</w:t>
+      </w:r>
+      <w:r>
+        <w:t xml:space="preserve">(6), 1154-1173. https://doi.org/10.1002/smj.2379</w:t>
+      </w:r>
+    </w:p>
+    <w:p>
+      <w:pPr>
+        <w:pStyle w:val="BodyText"/>
+      </w:pPr>
+      <w:r>
+        <w:t xml:space="preserve">Khanna, T., &amp; Palepu, K. G. (2010).</w:t>
+      </w:r>
+      <w:r>
+        <w:t xml:space="preserve"> </w:t>
+      </w:r>
+      <w:r>
+        <w:rPr>
+          <w:iCs/>
+          <w:i/>
+        </w:rPr>
+        <w:t xml:space="preserve">Winning in emerging markets: A road map for strategy and execution</w:t>
+      </w:r>
+      <w:r>
+        <w:t xml:space="preserve">. Harvard Business Press.</w:t>
+      </w:r>
+    </w:p>
+    <w:p>
+      <w:pPr>
+        <w:pStyle w:val="BodyText"/>
+      </w:pPr>
+      <w:r>
+        <w:t xml:space="preserve">Knight, G. A., &amp; Cavusgil, S. T. (2004). Innovation, organizational capabilities, and the born-global firm.</w:t>
+      </w:r>
+      <w:r>
+        <w:t xml:space="preserve"> </w:t>
+      </w:r>
+      <w:r>
+        <w:rPr>
+          <w:iCs/>
+          <w:i/>
+        </w:rPr>
+        <w:t xml:space="preserve">Journal of International Business Studies, 35</w:t>
+      </w:r>
+      <w:r>
+        <w:t xml:space="preserve">(2), 124-141. https://doi.org/10.1057/palgrave.jibs.8400071</w:t>
+      </w:r>
+    </w:p>
+    <w:p>
+      <w:pPr>
+        <w:pStyle w:val="BodyText"/>
+      </w:pPr>
+      <w:r>
+        <w:t xml:space="preserve">La Porta, R., &amp; Shleifer, A. (2014). Informality and development.</w:t>
+      </w:r>
+      <w:r>
+        <w:t xml:space="preserve"> </w:t>
+      </w:r>
+      <w:r>
+        <w:rPr>
+          <w:iCs/>
+          <w:i/>
+        </w:rPr>
+        <w:t xml:space="preserve">Journal of Economic Perspectives, 28</w:t>
+      </w:r>
+      <w:r>
+        <w:t xml:space="preserve">(3), 109-126. https://doi.org/10.1257/jep.28.3.109</w:t>
+      </w:r>
+    </w:p>
+    <w:p>
+      <w:pPr>
+        <w:pStyle w:val="BodyText"/>
+      </w:pPr>
+      <w:r>
+        <w:t xml:space="preserve">Lall, S. (1992). Technological capabilities and industrialization.</w:t>
+      </w:r>
+      <w:r>
+        <w:t xml:space="preserve"> </w:t>
+      </w:r>
+      <w:r>
+        <w:rPr>
+          <w:iCs/>
+          <w:i/>
+        </w:rPr>
+        <w:t xml:space="preserve">World Development, 20</w:t>
+      </w:r>
+      <w:r>
+        <w:t xml:space="preserve">(2), 165-186. https://doi.org/10.1016/0305-750X(92)90097-F</w:t>
+      </w:r>
+    </w:p>
+    <w:p>
+      <w:pPr>
+        <w:pStyle w:val="BodyText"/>
+      </w:pPr>
+      <w:r>
+        <w:t xml:space="preserve">Li, Y., Liu, Y., &amp; Qian, C. (2022). Digitalization, internationalization, and firm performance: Evidence from Chinese manufacturing firms.</w:t>
+      </w:r>
+      <w:r>
+        <w:t xml:space="preserve"> </w:t>
+      </w:r>
+      <w:r>
+        <w:rPr>
+          <w:iCs/>
+          <w:i/>
+        </w:rPr>
+        <w:t xml:space="preserve">International Business Review, 31</w:t>
+      </w:r>
+      <w:r>
+        <w:t xml:space="preserve">(3), 101953. https://doi.org/10.1016/j.ibusrev.2021.101953</w:t>
+      </w:r>
+    </w:p>
+    <w:p>
+      <w:pPr>
+        <w:pStyle w:val="BodyText"/>
+      </w:pPr>
+      <w:r>
+        <w:t xml:space="preserve">Lind, J. T., &amp; Mehlum, H. (2010). With or without U? The appropriate test for a U-shaped relationship.</w:t>
+      </w:r>
+      <w:r>
+        <w:t xml:space="preserve"> </w:t>
+      </w:r>
+      <w:r>
+        <w:rPr>
+          <w:iCs/>
+          <w:i/>
+        </w:rPr>
+        <w:t xml:space="preserve">Oxford Bulletin of Economics and Statistics, 72</w:t>
+      </w:r>
+      <w:r>
+        <w:t xml:space="preserve">(1), 109-118. https://doi.org/10.1111/j.1468-0084.2009.00569.x</w:t>
+      </w:r>
+    </w:p>
+    <w:p>
+      <w:pPr>
+        <w:pStyle w:val="BodyText"/>
+      </w:pPr>
+      <w:r>
+        <w:t xml:space="preserve">Long, J. S., &amp; Ervin, L. H. (2000). Using heteroscedasticity consistent standard errors in the linear regression model.</w:t>
+      </w:r>
+      <w:r>
+        <w:t xml:space="preserve"> </w:t>
+      </w:r>
+      <w:r>
+        <w:rPr>
+          <w:iCs/>
+          <w:i/>
+        </w:rPr>
+        <w:t xml:space="preserve">The American Statistician, 54</w:t>
+      </w:r>
+      <w:r>
+        <w:t xml:space="preserve">(3), 217-224. https://doi.org/10.1080/00031305.2000.10474549</w:t>
+      </w:r>
+    </w:p>
+    <w:p>
+      <w:pPr>
+        <w:pStyle w:val="BodyText"/>
+      </w:pPr>
+      <w:r>
+        <w:t xml:space="preserve">Lu, J. W., &amp; Beamish, P. W. (2004). International diversification and firm performance: The S-curve hypothesis.</w:t>
+      </w:r>
+      <w:r>
+        <w:t xml:space="preserve"> </w:t>
+      </w:r>
+      <w:r>
+        <w:rPr>
+          <w:iCs/>
+          <w:i/>
+        </w:rPr>
+        <w:t xml:space="preserve">Academy of Management Journal, 47</w:t>
+      </w:r>
+      <w:r>
+        <w:t xml:space="preserve">(4), 598-609. https://doi.org/10.2307/20159604</w:t>
+      </w:r>
+    </w:p>
+    <w:p>
+      <w:pPr>
+        <w:pStyle w:val="BodyText"/>
+      </w:pPr>
+      <w:r>
+        <w:t xml:space="preserve">MacKinnon, J. G., &amp; White, H. (1985). Some heteroskedasticity-consistent covariance matrix estimators with improved finite sample properties.</w:t>
+      </w:r>
+      <w:r>
+        <w:t xml:space="preserve"> </w:t>
+      </w:r>
+      <w:r>
+        <w:rPr>
+          <w:iCs/>
+          <w:i/>
+        </w:rPr>
+        <w:t xml:space="preserve">Journal of Econometrics, 29</w:t>
+      </w:r>
+      <w:r>
+        <w:t xml:space="preserve">(3), 305-325. https://doi.org/10.1016/0304-4076(85)90158-7</w:t>
+      </w:r>
+    </w:p>
+    <w:p>
+      <w:pPr>
+        <w:pStyle w:val="BodyText"/>
+      </w:pPr>
+      <w:r>
+        <w:t xml:space="preserve">Manova, K. (2013). Credit constraints, heterogeneous firms, and international trade.</w:t>
+      </w:r>
+      <w:r>
+        <w:t xml:space="preserve"> </w:t>
+      </w:r>
+      <w:r>
+        <w:rPr>
+          <w:iCs/>
+          <w:i/>
+        </w:rPr>
+        <w:t xml:space="preserve">Review of Economic Studies, 80</w:t>
+      </w:r>
+      <w:r>
+        <w:t xml:space="preserve">(2), 711-744. https://doi.org/10.1093/restud/rds036</w:t>
+      </w:r>
+    </w:p>
+    <w:p>
+      <w:pPr>
+        <w:pStyle w:val="BodyText"/>
+      </w:pPr>
+      <w:r>
+        <w:t xml:space="preserve">Mar, T. T., Do, T. H., &amp; Phan, A. T. (2026).</w:t>
+      </w:r>
+      <w:r>
+        <w:t xml:space="preserve"> </w:t>
+      </w:r>
+      <w:r>
+        <w:rPr>
+          <w:iCs/>
+          <w:i/>
+        </w:rPr>
+        <w:t xml:space="preserve">Digital adoption and the internationalization-performance curve: Evidence from Singapore firms</w:t>
+      </w:r>
+      <w:r>
+        <w:t xml:space="preserve"> </w:t>
+      </w:r>
+      <w:r>
+        <w:t xml:space="preserve">[Manuscript under review].</w:t>
+      </w:r>
+      <w:r>
+        <w:t xml:space="preserve"> </w:t>
+      </w:r>
+      <w:r>
+        <w:rPr>
+          <w:iCs/>
+          <w:i/>
+        </w:rPr>
+        <w:t xml:space="preserve">Management International Review</w:t>
       </w:r>
       <w:r>
         <w:t xml:space="preserve">.</w:t>
       </w:r>
-      <w:r>
-        <w:t xml:space="preserve"> </w:t>
-      </w:r>
-      <w:r>
-        <w:rPr>
-          <w:iCs/>
-          <w:i/>
-        </w:rPr>
-        <w:t xml:space="preserve">(Placeholder — replace with real P4 Singapore citation after review decision.)</w:t>
-      </w:r>
-    </w:p>
-    <w:p>
-      <w:pPr>
-        <w:pStyle w:val="BodyText"/>
-      </w:pPr>
-      <w:r>
-        <w:t xml:space="preserve">Banerjee, A. V., &amp; Duflo, E. (2014). Do firms want to borrow more? Testing credit constraints using a directed lending program.</w:t>
-      </w:r>
-      <w:r>
-        <w:t xml:space="preserve"> </w:t>
-      </w:r>
-      <w:r>
-        <w:rPr>
-          <w:iCs/>
-          <w:i/>
-        </w:rPr>
-        <w:t xml:space="preserve">Review of Economic Studies, 81</w:t>
-      </w:r>
-      <w:r>
-        <w:t xml:space="preserve">(2), 572-607. https://doi.org/10.1093/restud/rdt046</w:t>
-      </w:r>
-    </w:p>
-    <w:p>
-      <w:pPr>
-        <w:pStyle w:val="BodyText"/>
-      </w:pPr>
-      <w:r>
-        <w:t xml:space="preserve">Barney, J. (1991). Firm resources and sustained competitive advantage.</w:t>
-      </w:r>
-      <w:r>
-        <w:t xml:space="preserve"> </w:t>
-      </w:r>
-      <w:r>
-        <w:rPr>
-          <w:iCs/>
-          <w:i/>
-        </w:rPr>
-        <w:t xml:space="preserve">Journal of Management, 17</w:t>
-      </w:r>
-      <w:r>
-        <w:t xml:space="preserve">(1), 99-120. https://doi.org/10.1177/014920639101700108</w:t>
-      </w:r>
-    </w:p>
-    <w:p>
-      <w:pPr>
-        <w:pStyle w:val="BodyText"/>
-      </w:pPr>
-      <w:r>
-        <w:t xml:space="preserve">Bausch, A., &amp; Krist, M. (2007). The effect of context-related moderators on the internationalization-performance relationship: Evidence from meta-analysis.</w:t>
-      </w:r>
-      <w:r>
-        <w:t xml:space="preserve"> </w:t>
-      </w:r>
-      <w:r>
-        <w:rPr>
-          <w:iCs/>
-          <w:i/>
-        </w:rPr>
-        <w:t xml:space="preserve">Management International Review, 47</w:t>
-      </w:r>
-      <w:r>
-        <w:t xml:space="preserve">(3), 319-347. https://doi.org/10.1007/s11575-007-0019-z</w:t>
-      </w:r>
-    </w:p>
-    <w:p>
-      <w:pPr>
-        <w:pStyle w:val="BodyText"/>
-      </w:pPr>
-      <w:r>
-        <w:t xml:space="preserve">Begg, C. B., &amp; Mazumdar, M. (1994). Operating characteristics of a rank correlation test for publication bias.</w:t>
-      </w:r>
-      <w:r>
-        <w:t xml:space="preserve"> </w:t>
-      </w:r>
-      <w:r>
-        <w:rPr>
-          <w:iCs/>
-          <w:i/>
-        </w:rPr>
-        <w:t xml:space="preserve">Biometrics, 50</w:t>
-      </w:r>
-      <w:r>
-        <w:t xml:space="preserve">(4), 1088-1101. https://doi.org/10.2307/2533446</w:t>
-      </w:r>
-    </w:p>
-    <w:p>
-      <w:pPr>
-        <w:pStyle w:val="BodyText"/>
-      </w:pPr>
-      <w:r>
-        <w:t xml:space="preserve">Bertram, G. (2006). Introduction: The MIRAB model in the twenty-first century.</w:t>
-      </w:r>
-      <w:r>
-        <w:t xml:space="preserve"> </w:t>
-      </w:r>
-      <w:r>
-        <w:rPr>
-          <w:iCs/>
-          <w:i/>
-        </w:rPr>
-        <w:t xml:space="preserve">Asia Pacific Viewpoint, 47</w:t>
-      </w:r>
-      <w:r>
-        <w:t xml:space="preserve">(1), 1-13. https://doi.org/10.1111/j.1467-8373.2006.00297.x</w:t>
-      </w:r>
-    </w:p>
-    <w:p>
-      <w:pPr>
-        <w:pStyle w:val="BodyText"/>
-      </w:pPr>
-      <w:r>
-        <w:t xml:space="preserve">Brynjolfsson, E., &amp; McAfee, A. (2014).</w:t>
-      </w:r>
-      <w:r>
-        <w:t xml:space="preserve"> </w:t>
-      </w:r>
-      <w:r>
-        <w:rPr>
-          <w:iCs/>
-          <w:i/>
-        </w:rPr>
-        <w:t xml:space="preserve">The second machine age: Work, progress, and prosperity in a time of brilliant technologies</w:t>
-      </w:r>
-      <w:r>
-        <w:t xml:space="preserve">. W. W. Norton &amp; Company.</w:t>
-      </w:r>
-    </w:p>
-    <w:p>
-      <w:pPr>
-        <w:pStyle w:val="BodyText"/>
-      </w:pPr>
-      <w:r>
-        <w:t xml:space="preserve">Brynjolfsson, E., Rock, D., &amp; Syverson, C. (2021). The productivity J-curve: How intangibles complement general purpose technologies.</w:t>
-      </w:r>
-      <w:r>
-        <w:t xml:space="preserve"> </w:t>
-      </w:r>
-      <w:r>
-        <w:rPr>
-          <w:iCs/>
-          <w:i/>
-        </w:rPr>
-        <w:t xml:space="preserve">American Economic Journal: Macroeconomics, 13</w:t>
-      </w:r>
-      <w:r>
-        <w:t xml:space="preserve">(1), 333-372. https://doi.org/10.1257/mac.20180386</w:t>
-      </w:r>
-    </w:p>
-    <w:p>
-      <w:pPr>
-        <w:pStyle w:val="BodyText"/>
-      </w:pPr>
-      <w:r>
-        <w:t xml:space="preserve">Buckley, P. J., Clegg, L. J., Cross, A. R., Liu, X., Voss, H., &amp; Zheng, P. (2007). The determinants of Chinese outward foreign direct investment.</w:t>
-      </w:r>
-      <w:r>
-        <w:t xml:space="preserve"> </w:t>
-      </w:r>
-      <w:r>
-        <w:rPr>
-          <w:iCs/>
-          <w:i/>
-        </w:rPr>
-        <w:t xml:space="preserve">Journal of International Business Studies, 38</w:t>
-      </w:r>
-      <w:r>
-        <w:t xml:space="preserve">(4), 499-518. https://doi.org/10.1057/palgrave.jibs.8400277</w:t>
-      </w:r>
-    </w:p>
-    <w:p>
-      <w:pPr>
-        <w:pStyle w:val="BodyText"/>
-      </w:pPr>
-      <w:r>
-        <w:t xml:space="preserve">Cohen, W. M., &amp; Levinthal, D. A. (1990). Absorptive capacity: A new perspective on learning and innovation.</w:t>
-      </w:r>
-      <w:r>
-        <w:t xml:space="preserve"> </w:t>
-      </w:r>
-      <w:r>
-        <w:rPr>
-          <w:iCs/>
-          <w:i/>
-        </w:rPr>
-        <w:t xml:space="preserve">Administrative Science Quarterly, 35</w:t>
-      </w:r>
-      <w:r>
-        <w:t xml:space="preserve">(1), 128-152. https://doi.org/10.2307/2393553</w:t>
-      </w:r>
-    </w:p>
-    <w:p>
-      <w:pPr>
-        <w:pStyle w:val="BodyText"/>
-      </w:pPr>
-      <w:r>
-        <w:t xml:space="preserve">Cusolito, A. P., &amp; Maloney, W. F. (2018).</w:t>
-      </w:r>
-      <w:r>
-        <w:t xml:space="preserve"> </w:t>
-      </w:r>
-      <w:r>
-        <w:rPr>
-          <w:iCs/>
-          <w:i/>
-        </w:rPr>
-        <w:t xml:space="preserve">Productivity revisited: Shifting paradigms in analysis and policy</w:t>
-      </w:r>
-      <w:r>
-        <w:t xml:space="preserve">. World Bank. https://doi.org/10.1596/978-1-4648-1219-6</w:t>
-      </w:r>
-    </w:p>
-    <w:p>
-      <w:pPr>
-        <w:pStyle w:val="BodyText"/>
-      </w:pPr>
-      <w:r>
-        <w:t xml:space="preserve">Demir, B., &amp; Javorcik, B. (2018). Don’t throw in the towel, throw in trade credit!</w:t>
-      </w:r>
-      <w:r>
-        <w:t xml:space="preserve"> </w:t>
-      </w:r>
-      <w:r>
-        <w:rPr>
-          <w:iCs/>
-          <w:i/>
-        </w:rPr>
-        <w:t xml:space="preserve">Journal of International Economics, 111</w:t>
-      </w:r>
-      <w:r>
-        <w:t xml:space="preserve">, 177-189. https://doi.org/10.1016/j.jinteco.2018.01.008</w:t>
-      </w:r>
-    </w:p>
-    <w:p>
-      <w:pPr>
-        <w:pStyle w:val="BodyText"/>
-      </w:pPr>
-      <w:r>
-        <w:t xml:space="preserve">Duval, S., &amp; Tweedie, R. (2000). Trim and fill: A simple funnel-plot-based method of testing and adjusting for publication bias in meta-analysis.</w:t>
-      </w:r>
-      <w:r>
-        <w:t xml:space="preserve"> </w:t>
-      </w:r>
-      <w:r>
-        <w:rPr>
-          <w:iCs/>
-          <w:i/>
-        </w:rPr>
-        <w:t xml:space="preserve">Biometrics, 56</w:t>
-      </w:r>
-      <w:r>
-        <w:t xml:space="preserve">(2), 455-463. https://doi.org/10.1111/j.0006-341X.2000.00455.x</w:t>
-      </w:r>
-    </w:p>
-    <w:p>
-      <w:pPr>
-        <w:pStyle w:val="BodyText"/>
-      </w:pPr>
-      <w:r>
-        <w:t xml:space="preserve">Eden, L., &amp; Nielsen, B. B. (2020). Research methods in international business: The challenge of complexity.</w:t>
-      </w:r>
-      <w:r>
-        <w:t xml:space="preserve"> </w:t>
-      </w:r>
-      <w:r>
-        <w:rPr>
-          <w:iCs/>
-          <w:i/>
-        </w:rPr>
-        <w:t xml:space="preserve">Journal of International Business Studies, 51</w:t>
-      </w:r>
-      <w:r>
-        <w:t xml:space="preserve">(9), 1609-1620. https://doi.org/10.1057/s41267-020-00374-2</w:t>
-      </w:r>
-    </w:p>
-    <w:p>
-      <w:pPr>
-        <w:pStyle w:val="BodyText"/>
-      </w:pPr>
-      <w:r>
-        <w:t xml:space="preserve">Egger, M., Davey Smith, G., Schneider, M., &amp; Minder, C. (1997). Bias in meta-analysis detected by a simple, graphical test.</w:t>
-      </w:r>
-      <w:r>
-        <w:t xml:space="preserve"> </w:t>
-      </w:r>
-      <w:r>
-        <w:rPr>
-          <w:iCs/>
-          <w:i/>
-        </w:rPr>
-        <w:t xml:space="preserve">British Medical Journal, 315</w:t>
-      </w:r>
-      <w:r>
-        <w:t xml:space="preserve">(7109), 629-634. https://doi.org/10.1136/bmj.315.7109.629</w:t>
-      </w:r>
-    </w:p>
-    <w:p>
-      <w:pPr>
-        <w:pStyle w:val="BodyText"/>
-      </w:pPr>
-      <w:r>
-        <w:t xml:space="preserve">Haans, R. F. J., Pieters, C., &amp; He, Z.-L. (2016). Thinking about U: Theorizing and testing U- and inverted U-shaped relationships in strategy research.</w:t>
-      </w:r>
-      <w:r>
-        <w:t xml:space="preserve"> </w:t>
-      </w:r>
-      <w:r>
-        <w:rPr>
-          <w:iCs/>
-          <w:i/>
-        </w:rPr>
-        <w:t xml:space="preserve">Strategic Management Journal, 37</w:t>
-      </w:r>
-      <w:r>
-        <w:t xml:space="preserve">(7), 1177-1195. https://doi.org/10.1002/smj.2399</w:t>
-      </w:r>
-    </w:p>
-    <w:p>
-      <w:pPr>
-        <w:pStyle w:val="BodyText"/>
-      </w:pPr>
-      <w:r>
-        <w:t xml:space="preserve">Hall, P. A., &amp; Soskice, D. (2001).</w:t>
-      </w:r>
-      <w:r>
-        <w:t xml:space="preserve"> </w:t>
-      </w:r>
-      <w:r>
-        <w:rPr>
-          <w:iCs/>
-          <w:i/>
-        </w:rPr>
-        <w:t xml:space="preserve">Varieties of capitalism: The institutional foundations of comparative advantage</w:t>
-      </w:r>
-      <w:r>
-        <w:t xml:space="preserve">. Oxford University Press. https://doi.org/10.1093/0199247757.001.0001</w:t>
-      </w:r>
-    </w:p>
-    <w:p>
-      <w:pPr>
-        <w:pStyle w:val="BodyText"/>
-      </w:pPr>
-      <w:r>
-        <w:t xml:space="preserve">Hennart, J.-F. (2007). The theoretical rationale for a multinationality-performance relationship.</w:t>
-      </w:r>
-      <w:r>
-        <w:t xml:space="preserve"> </w:t>
-      </w:r>
-      <w:r>
-        <w:rPr>
-          <w:iCs/>
-          <w:i/>
-        </w:rPr>
-        <w:t xml:space="preserve">Management International Review, 47</w:t>
-      </w:r>
-      <w:r>
-        <w:t xml:space="preserve">(3), 423-452. https://doi.org/10.1007/s11575-007-0022-4</w:t>
-      </w:r>
-    </w:p>
-    <w:p>
-      <w:pPr>
-        <w:pStyle w:val="BodyText"/>
-      </w:pPr>
-      <w:r>
-        <w:t xml:space="preserve">Hitt, M. A., Hoskisson, R. E., &amp; Kim, H. (1997). International diversification: Effects on innovation and firm performance in product-diversified firms.</w:t>
-      </w:r>
-      <w:r>
-        <w:t xml:space="preserve"> </w:t>
-      </w:r>
-      <w:r>
-        <w:rPr>
-          <w:iCs/>
-          <w:i/>
-        </w:rPr>
-        <w:t xml:space="preserve">Academy of Management Journal, 40</w:t>
-      </w:r>
-      <w:r>
-        <w:t xml:space="preserve">(4), 767-798. https://doi.org/10.2307/256948</w:t>
-      </w:r>
-    </w:p>
-    <w:p>
-      <w:pPr>
-        <w:pStyle w:val="BodyText"/>
-      </w:pPr>
-      <w:r>
-        <w:t xml:space="preserve">Hsieh, C.-T., &amp; Klenow, P. J. (2009). Misallocation and manufacturing TFP in China and India.</w:t>
-      </w:r>
-      <w:r>
-        <w:t xml:space="preserve"> </w:t>
-      </w:r>
-      <w:r>
-        <w:rPr>
-          <w:iCs/>
-          <w:i/>
-        </w:rPr>
-        <w:t xml:space="preserve">Quarterly Journal of Economics, 124</w:t>
-      </w:r>
-      <w:r>
-        <w:t xml:space="preserve">(4), 1403-1448. https://doi.org/10.1162/qjec.2009.124.4.1403</w:t>
-      </w:r>
-    </w:p>
-    <w:p>
-      <w:pPr>
-        <w:pStyle w:val="BodyText"/>
-      </w:pPr>
-      <w:r>
-        <w:t xml:space="preserve">Hsu, M.-L., &amp; Boggs, D. J. (2003). Internationalization and performance: Traditional measures and their decomposition.</w:t>
-      </w:r>
-      <w:r>
-        <w:t xml:space="preserve"> </w:t>
-      </w:r>
-      <w:r>
-        <w:rPr>
-          <w:iCs/>
-          <w:i/>
-        </w:rPr>
-        <w:t xml:space="preserve">Multinational Business Review, 11</w:t>
-      </w:r>
-      <w:r>
-        <w:t xml:space="preserve">(3), 23-49. https://doi.org/10.1108/1525383X200300015</w:t>
-      </w:r>
-    </w:p>
-    <w:p>
-      <w:pPr>
-        <w:pStyle w:val="BodyText"/>
-      </w:pPr>
-      <w:r>
-        <w:t xml:space="preserve">Hsu, W. T., Chen, H. L., &amp; Cheng, C. Y. (2013). Internationalization and firm performance of SMEs: The moderating effects of CEO attributes.</w:t>
-      </w:r>
-      <w:r>
-        <w:t xml:space="preserve"> </w:t>
-      </w:r>
-      <w:r>
-        <w:rPr>
-          <w:iCs/>
-          <w:i/>
-        </w:rPr>
-        <w:t xml:space="preserve">Journal of World Business, 48</w:t>
-      </w:r>
-      <w:r>
-        <w:t xml:space="preserve">(1), 1-12. https://doi.org/10.1016/j.jwb.2012.06.001</w:t>
-      </w:r>
-    </w:p>
-    <w:p>
-      <w:pPr>
-        <w:pStyle w:val="BodyText"/>
-      </w:pPr>
-      <w:r>
-        <w:t xml:space="preserve">Johanson, J., &amp; Vahlne, J.-E. (1977). The internationalization process of the firm — A model of knowledge development and increasing foreign market commitments.</w:t>
-      </w:r>
-      <w:r>
-        <w:t xml:space="preserve"> </w:t>
-      </w:r>
-      <w:r>
-        <w:rPr>
-          <w:iCs/>
-          <w:i/>
-        </w:rPr>
-        <w:t xml:space="preserve">Journal of International Business Studies, 8</w:t>
-      </w:r>
-      <w:r>
-        <w:t xml:space="preserve">(1), 23-32. https://doi.org/10.1057/palgrave.jibs.8490676</w:t>
-      </w:r>
-    </w:p>
-    <w:p>
-      <w:pPr>
-        <w:pStyle w:val="BodyText"/>
-      </w:pPr>
-      <w:r>
-        <w:t xml:space="preserve">Kano, L., Tsang, E. W. K., &amp; Yeung, H. W.-C. (2020). Global value chains: A review of the multi-disciplinary literature.</w:t>
-      </w:r>
-      <w:r>
-        <w:t xml:space="preserve"> </w:t>
-      </w:r>
-      <w:r>
-        <w:rPr>
-          <w:iCs/>
-          <w:i/>
-        </w:rPr>
-        <w:t xml:space="preserve">Journal of International Business Studies, 51</w:t>
-      </w:r>
-      <w:r>
-        <w:t xml:space="preserve">(4), 577-622. https://doi.org/10.1057/s41267-020-00304-2</w:t>
-      </w:r>
-    </w:p>
-    <w:p>
-      <w:pPr>
-        <w:pStyle w:val="BodyText"/>
-      </w:pPr>
-      <w:r>
-        <w:t xml:space="preserve">Karna, A., Richter, A., &amp; Riesenkampff, E. (2016). Revisiting the role of the environment in the capabilities-financial performance relationship: A meta-analysis.</w:t>
-      </w:r>
-      <w:r>
-        <w:t xml:space="preserve"> </w:t>
-      </w:r>
-      <w:r>
-        <w:rPr>
-          <w:iCs/>
-          <w:i/>
-        </w:rPr>
-        <w:t xml:space="preserve">Strategic Management Journal, 37</w:t>
-      </w:r>
-      <w:r>
-        <w:t xml:space="preserve">(6), 1154-1173. https://doi.org/10.1002/smj.2379</w:t>
-      </w:r>
-    </w:p>
-    <w:p>
-      <w:pPr>
-        <w:pStyle w:val="BodyText"/>
-      </w:pPr>
-      <w:r>
-        <w:t xml:space="preserve">Khanna, T., &amp; Palepu, K. G. (2010).</w:t>
-      </w:r>
-      <w:r>
-        <w:t xml:space="preserve"> </w:t>
-      </w:r>
-      <w:r>
-        <w:rPr>
-          <w:iCs/>
-          <w:i/>
-        </w:rPr>
-        <w:t xml:space="preserve">Winning in emerging markets: A road map for strategy and execution</w:t>
-      </w:r>
-      <w:r>
-        <w:t xml:space="preserve">. Harvard Business Press.</w:t>
-      </w:r>
-    </w:p>
-    <w:p>
-      <w:pPr>
-        <w:pStyle w:val="BodyText"/>
-      </w:pPr>
-      <w:r>
-        <w:t xml:space="preserve">Knight, G. A., &amp; Cavusgil, S. T. (2004). Innovation, organizational capabilities, and the born-global firm.</w:t>
-      </w:r>
-      <w:r>
-        <w:t xml:space="preserve"> </w:t>
-      </w:r>
-      <w:r>
-        <w:rPr>
-          <w:iCs/>
-          <w:i/>
-        </w:rPr>
-        <w:t xml:space="preserve">Journal of International Business Studies, 35</w:t>
-      </w:r>
-      <w:r>
-        <w:t xml:space="preserve">(2), 124-141. https://doi.org/10.1057/palgrave.jibs.8400071</w:t>
-      </w:r>
-    </w:p>
-    <w:p>
-      <w:pPr>
-        <w:pStyle w:val="BodyText"/>
-      </w:pPr>
-      <w:r>
-        <w:t xml:space="preserve">La Porta, R., &amp; Shleifer, A. (2014). Informality and development.</w:t>
-      </w:r>
-      <w:r>
-        <w:t xml:space="preserve"> </w:t>
-      </w:r>
-      <w:r>
-        <w:rPr>
-          <w:iCs/>
-          <w:i/>
-        </w:rPr>
-        <w:t xml:space="preserve">Journal of Economic Perspectives, 28</w:t>
-      </w:r>
-      <w:r>
-        <w:t xml:space="preserve">(3), 109-126. https://doi.org/10.1257/jep.28.3.109</w:t>
-      </w:r>
-    </w:p>
-    <w:p>
-      <w:pPr>
-        <w:pStyle w:val="BodyText"/>
-      </w:pPr>
-      <w:r>
-        <w:t xml:space="preserve">Lall, S. (1992). Technological capabilities and industrialization.</w:t>
-      </w:r>
-      <w:r>
-        <w:t xml:space="preserve"> </w:t>
-      </w:r>
-      <w:r>
-        <w:rPr>
-          <w:iCs/>
-          <w:i/>
-        </w:rPr>
-        <w:t xml:space="preserve">World Development, 20</w:t>
-      </w:r>
-      <w:r>
-        <w:t xml:space="preserve">(2), 165-186. https://doi.org/10.1016/0305-750X(92)90097-F</w:t>
-      </w:r>
-    </w:p>
-    <w:p>
-      <w:pPr>
-        <w:pStyle w:val="BodyText"/>
-      </w:pPr>
-      <w:r>
-        <w:t xml:space="preserve">Li, Y., Liu, Y., &amp; Qian, C. (2022). Digitalization, internationalization, and firm performance: Evidence from Chinese manufacturing firms.</w:t>
-      </w:r>
-      <w:r>
-        <w:t xml:space="preserve"> </w:t>
-      </w:r>
-      <w:r>
-        <w:rPr>
-          <w:iCs/>
-          <w:i/>
-        </w:rPr>
-        <w:t xml:space="preserve">International Business Review, 31</w:t>
-      </w:r>
-      <w:r>
-        <w:t xml:space="preserve">(3), 101953. https://doi.org/10.1016/j.ibusrev.2021.101953</w:t>
-      </w:r>
-    </w:p>
-    <w:p>
-      <w:pPr>
-        <w:pStyle w:val="BodyText"/>
-      </w:pPr>
-      <w:r>
-        <w:t xml:space="preserve">Lind, J. T., &amp; Mehlum, H. (2010). With or without U? The appropriate test for a U-shaped relationship.</w:t>
-      </w:r>
-      <w:r>
-        <w:t xml:space="preserve"> </w:t>
-      </w:r>
-      <w:r>
-        <w:rPr>
-          <w:iCs/>
-          <w:i/>
-        </w:rPr>
-        <w:t xml:space="preserve">Oxford Bulletin of Economics and Statistics, 72</w:t>
-      </w:r>
-      <w:r>
-        <w:t xml:space="preserve">(1), 109-118. https://doi.org/10.1111/j.1468-0084.2009.00569.x</w:t>
-      </w:r>
-    </w:p>
-    <w:p>
-      <w:pPr>
-        <w:pStyle w:val="BodyText"/>
-      </w:pPr>
-      <w:r>
-        <w:t xml:space="preserve">Long, J. S., &amp; Ervin, L. H. (2000). Using heteroscedasticity consistent standard errors in the linear regression model.</w:t>
-      </w:r>
-      <w:r>
-        <w:t xml:space="preserve"> </w:t>
-      </w:r>
-      <w:r>
-        <w:rPr>
-          <w:iCs/>
-          <w:i/>
-        </w:rPr>
-        <w:t xml:space="preserve">The American Statistician, 54</w:t>
-      </w:r>
-      <w:r>
-        <w:t xml:space="preserve">(3), 217-224. https://doi.org/10.1080/00031305.2000.10474549</w:t>
-      </w:r>
-    </w:p>
-    <w:p>
-      <w:pPr>
-        <w:pStyle w:val="BodyText"/>
-      </w:pPr>
-      <w:r>
-        <w:t xml:space="preserve">Lu, J. W., &amp; Beamish, P. W. (2004). International diversification and firm performance: The S-curve hypothesis.</w:t>
-      </w:r>
-      <w:r>
-        <w:t xml:space="preserve"> </w:t>
-      </w:r>
-      <w:r>
-        <w:rPr>
-          <w:iCs/>
-          <w:i/>
-        </w:rPr>
-        <w:t xml:space="preserve">Academy of Management Journal, 47</w:t>
-      </w:r>
-      <w:r>
-        <w:t xml:space="preserve">(4), 598-609. https://doi.org/10.2307/20159604</w:t>
-      </w:r>
-    </w:p>
-    <w:p>
-      <w:pPr>
-        <w:pStyle w:val="BodyText"/>
-      </w:pPr>
-      <w:r>
-        <w:t xml:space="preserve">MacKinnon, J. G., &amp; White, H. (1985). Some heteroskedasticity-consistent covariance matrix estimators with improved finite sample properties.</w:t>
-      </w:r>
-      <w:r>
-        <w:t xml:space="preserve"> </w:t>
-      </w:r>
-      <w:r>
-        <w:rPr>
-          <w:iCs/>
-          <w:i/>
-        </w:rPr>
-        <w:t xml:space="preserve">Journal of Econometrics, 29</w:t>
-      </w:r>
-      <w:r>
-        <w:t xml:space="preserve">(3), 305-325. https://doi.org/10.1016/0304-4076(85)90158-7</w:t>
-      </w:r>
-    </w:p>
-    <w:p>
-      <w:pPr>
-        <w:pStyle w:val="BodyText"/>
-      </w:pPr>
-      <w:r>
-        <w:t xml:space="preserve">Manova, K. (2013). Credit constraints, heterogeneous firms, and international trade.</w:t>
-      </w:r>
-      <w:r>
-        <w:t xml:space="preserve"> </w:t>
-      </w:r>
-      <w:r>
-        <w:rPr>
-          <w:iCs/>
-          <w:i/>
-        </w:rPr>
-        <w:t xml:space="preserve">Review of Economic Studies, 80</w:t>
-      </w:r>
-      <w:r>
-        <w:t xml:space="preserve">(2), 711-744. https://doi.org/10.1093/restud/rds036</w:t>
-      </w:r>
-    </w:p>
-    <w:p>
-      <w:pPr>
-        <w:pStyle w:val="BodyText"/>
-      </w:pPr>
-      <w:r>
-        <w:t xml:space="preserve">Mar, T. T., Do, T. H., &amp; Phan, A. T. (2026).</w:t>
-      </w:r>
-      <w:r>
-        <w:t xml:space="preserve"> </w:t>
-      </w:r>
-      <w:r>
-        <w:rPr>
-          <w:iCs/>
-          <w:i/>
-        </w:rPr>
-        <w:t xml:space="preserve">Digital adoption and the internationalization-performance curve: Evidence from Singapore firms</w:t>
-      </w:r>
-      <w:r>
-        <w:t xml:space="preserve"> </w:t>
-      </w:r>
-      <w:r>
-        <w:t xml:space="preserve">[Manuscript under review].</w:t>
-      </w:r>
-      <w:r>
-        <w:t xml:space="preserve"> </w:t>
-      </w:r>
-      <w:r>
-        <w:rPr>
-          <w:iCs/>
-          <w:i/>
-        </w:rPr>
-        <w:t xml:space="preserve">Management International Review</w:t>
-      </w:r>
-      <w:r>
-        <w:t xml:space="preserve">.</w:t>
-      </w:r>
     </w:p>
     <w:p>
       <w:pPr>
@@ -4781,6 +4798,27 @@
       </w:r>
       <w:r>
         <w:t xml:space="preserve">(3), 315-321. https://doi.org/10.1016/S0969-5931(98)00013-4</w:t>
+      </w:r>
+    </w:p>
+    <w:p>
+      <w:pPr>
+        <w:pStyle w:val="BodyText"/>
+      </w:pPr>
+      <w:r>
+        <w:t xml:space="preserve">Richard, P. J., Devinney, T. M., Yip, G. S., &amp; Johnson, G. (2009). Measuring organizational performance: Towards methodological best practice.</w:t>
+      </w:r>
+      <w:r>
+        <w:t xml:space="preserve"> </w:t>
+      </w:r>
+      <w:r>
+        <w:rPr>
+          <w:iCs/>
+          <w:i/>
+        </w:rPr>
+        <w:t xml:space="preserve">Journal of Management, 35</w:t>
+      </w:r>
+      <w:r>
+        <w:t xml:space="preserve">(3), 718-804. https://doi.org/10.1177/0149206308330560</w:t>
       </w:r>
     </w:p>
     <w:p>

</xml_diff>

<commit_message>
build(dist): rebuild final deliverables; ignore zip artifacts
https://claude.ai/code/session_01TqgqRfCDLY39798jcQXCr9
</commit_message>
<xml_diff>
--- a/dist/downloads/04_references_apa7.docx
+++ b/dist/downloads/04_references_apa7.docx
@@ -88,7 +88,7 @@
         <w:t xml:space="preserve"> </w:t>
       </w:r>
       <w:r>
-        <w:t xml:space="preserve">→</w:t>
+        <w:t xml:space="preserve">thành</w:t>
       </w:r>
       <w:r>
         <w:t xml:space="preserve"> </w:t>
@@ -106,7 +106,7 @@
         <w:t xml:space="preserve"> </w:t>
       </w:r>
       <w:r>
-        <w:t xml:space="preserve">theo APA 7th §8.31.</w:t>
+        <w:t xml:space="preserve">theo APA 7th Mục 8.31.</w:t>
       </w:r>
     </w:p>
     <w:p>
@@ -211,7 +211,7 @@
         <w:t xml:space="preserve"> </w:t>
       </w:r>
       <w:r>
-        <w:t xml:space="preserve">(5 entries): (i) Pirlea &amp; Corso (2026) internet access digital divide; (ii) Mahler, Wang &amp; Weber (2026) AI inequality; (iii) Pirlea et al. (2026) Atlas of Global Development 2026; (iv) Agnolucci, Kenworthy &amp; Kose (2026) Middle East war → commodity markets; (v) Boeddu, Feyen et al. (2025) AI for Financial Sector Supervision (G20 report).</w:t>
+        <w:t xml:space="preserve">(5 entries): (i) Pirlea &amp; Corso (2026) internet access digital divide; (ii) Mahler, Wang &amp; Weber (2026) AI inequality; (iii) Pirlea et al. (2026) Atlas of Global Development 2026; (iv) Agnolucci, Kenworthy &amp; Kose (2026) Middle East war thành commodity markets; (v) Boeddu, Feyen et al. (2025) AI for Financial Sector Supervision (G20 report).</w:t>
       </w:r>
     </w:p>
     <w:p>
@@ -242,7 +242,7 @@
         <w:t xml:space="preserve"> </w:t>
       </w:r>
       <w:r>
-        <w:t xml:space="preserve">(5 entries) phục vụ cập nhật §1.1 và §5.1 của P4 Singapore: (i) Enterprise Singapore (2025) SWITCH 2025; (ii) GovTech Singapore (2024) Digital Government Rankings; (iii) IMDA (2025) ATxSG 2025; (iv) StartupBlink (2025) Global Startup Ecosystem Index; (v) StartupBlink (2026) Innovators Business Environment Index.</w:t>
+        <w:t xml:space="preserve">(5 entries) phục vụ cập nhật Mục 1.1 và Mục 5.1 của P4 Singapore: (i) Enterprise Singapore (2025) SWITCH 2025; (ii) GovTech Singapore (2024) Digital Government Rankings; (iii) IMDA (2025) ATxSG 2025; (iv) StartupBlink (2025) Global Startup Ecosystem Index; (v) StartupBlink (2026) Innovators Business Environment Index.</w:t>
       </w:r>
     </w:p>
     <w:p>
@@ -290,7 +290,7 @@
         <w:t xml:space="preserve"> </w:t>
       </w:r>
       <w:r>
-        <w:t xml:space="preserve">(Section P); (ii) in-text citations trong P8 §1 (SIDS development lag) và §3.2 (DAI null context — Mahler et al. 2026). Khatua et al. (2024) APA7 format corrected to advance online publication.</w:t>
+        <w:t xml:space="preserve">(Section P); (ii) in-text citations trong P8 Mục 1 (SIDS development lag) và Mục 3.2 (DAI null context — Mahler et al. 2026). Khatua et al. (2024) APA7 format corrected to advance online publication.</w:t>
       </w:r>
     </w:p>
     <w:p>
@@ -321,7 +321,7 @@
         <w:t xml:space="preserve"> </w:t>
       </w:r>
       <w:r>
-        <w:t xml:space="preserve">(5 entries) từ đánh giá 11 PDFs upload ngày 16/05/2026: (i) Agarwal, Barattieri &amp; Mattoo (2026) WPS11352 — Vietnam firm LP tăng theo export demand shock; (ii) Barattieri, Mattoo &amp; Signoret (2026) WPS11354 — Vietnam trade liberalization → +2.9%/yr productivity; (iii) Geginat &amp; Ramalho (2015) WPS7460 — electricity quality &amp; firm performance 183 countries (P8/CD1); (iv) Kim, Kumar, Ramalho &amp; Russell (2026) WPS11279 — institutional capacity framework for ICRV (CD2/thesis); (v) Mahler, Serajuddin, Wadhwa &amp; Yonzan (2026) WPS11350 — world slowest development pace 75 yrs, SIDS ≥100 yrs from standards (P8).</w:t>
+        <w:t xml:space="preserve">(5 entries) từ đánh giá 11 PDFs upload ngày 16/05/2026: (i) Agarwal, Barattieri &amp; Mattoo (2026) WPS11352 — Vietnam firm LP tăng theo export demand shock; (ii) Barattieri, Mattoo &amp; Signoret (2026) WPS11354 — Vietnam trade liberalization thành +2.9%/yr productivity; (iii) Geginat &amp; Ramalho (2015) WPS7460 — electricity quality &amp; firm performance 183 countries (P8/CD1); (iv) Kim, Kumar, Ramalho &amp; Russell (2026) WPS11279 — institutional capacity framework for ICRV (CD2/thesis); (v) Mahler, Serajuddin, Wadhwa &amp; Yonzan (2026) WPS11350 — world slowest development pace 75 yrs, SIDS ≥100 yrs from standards (P8).</w:t>
       </w:r>
       <w:r>
         <w:t xml:space="preserve"> </w:t>
@@ -370,7 +370,7 @@
         <w:t xml:space="preserve"> </w:t>
       </w:r>
       <w:r>
-        <w:t xml:space="preserve">= Atlas chapter (Section P). In-text citations added: P3 §5 (Agarwal + Barattieri), P8 §1 (Mahler et al. 2026b), CD2 §3.3 Tầng 3 (Kim et al. 2026).</w:t>
+        <w:t xml:space="preserve">= Atlas chapter (Section P). In-text citations added: P3 Mục 5 (Agarwal + Barattieri), P8 Mục 1 (Mahler et al. 2026b), CD2 Mục 3.3 Tầng 3 (Kim et al. 2026).</w:t>
       </w:r>
     </w:p>
     <w:p>
@@ -478,7 +478,7 @@
         <w:t xml:space="preserve">RESOLVED Audit Warning 1 v2.4</w:t>
       </w:r>
       <w:r>
-        <w:t xml:space="preserve">: Lin &amp; Beamish (2005) → Lu &amp; Beamish (2004) replacement đã hoàn tất trong file 14 v3.8 (commit e2f8415).</w:t>
+        <w:t xml:space="preserve">: Lin &amp; Beamish (2005) thành Lu &amp; Beamish (2004) replacement đã hoàn tất trong file 14 v3.8 (commit e2f8415).</w:t>
       </w:r>
     </w:p>
     <w:p>
@@ -760,7 +760,7 @@
         <w:t xml:space="preserve">RESOLVED v2.5 — Audit Warning 1</w:t>
       </w:r>
       <w:r>
-        <w:t xml:space="preserve">: Lin &amp; Beamish (2005) → Lu &amp; Beamish (2004) replacement đã hoàn tất trong file 14 v3.8 (commit e2f8415, 07/05/2026): 4 occurrences trong §1.1, §2.6, Bảng 2.6.1 đã updated. Lu &amp; Beamish (2004) AMJ S-curve DOI 10.2307/20159604 đã có sẵn Section B từ v2.1.</w:t>
+        <w:t xml:space="preserve">: Lin &amp; Beamish (2005) thành Lu &amp; Beamish (2004) replacement đã hoàn tất trong file 14 v3.8 (commit e2f8415, 07/05/2026): 4 occurrences trong Mục 1.1, Mục 2.6, Bảng 2.6.1 đã updated. Lu &amp; Beamish (2004) AMJ S-curve DOI 10.2307/20159604 đã có sẵn Section B từ v2.1.</w:t>
       </w:r>
     </w:p>
     <w:bookmarkEnd w:id="21"/>
@@ -2524,7 +2524,7 @@
           <w:iCs/>
           <w:i/>
         </w:rPr>
-        <w:t xml:space="preserve">per §8.31. Cited file 09b_vn_term_glossary.md cho thuật ngữ chuẩn + chuyển dịch tiếng Việt CĐ1 v3.x.)</w:t>
+        <w:t xml:space="preserve">per Mục 8.31. Cited file 09b_vn_term_glossary.md cho thuật ngữ chuẩn + chuyển dịch tiếng Việt CĐ1 v3.x.)</w:t>
       </w:r>
     </w:p>
     <w:p>
@@ -2698,7 +2698,7 @@
           <w:iCs/>
           <w:i/>
         </w:rPr>
-        <w:t xml:space="preserve">để tính GNI per capita. Cited §1.3 phạm vi không gian (47 nước châu Á phân loại theo income group) + §3 ICRV regime classification trong CĐ1 v3.x.)</w:t>
+        <w:t xml:space="preserve">để tính GNI per capita. Cited Mục 1.3 phạm vi không gian (47 nước châu Á phân loại theo income group) + Mục 3 ICRV regime classification trong CĐ1 v3.x.)</w:t>
       </w:r>
     </w:p>
     <w:p>
@@ -3061,7 +3061,7 @@
           <w:iCs/>
           <w:i/>
         </w:rPr>
-        <w:t xml:space="preserve">stage; (d) Lạm phát dự phóng 4,0%; (e) Two-tier framing: FDI-sector 18% global solution contribution vs SMEs nội địa cần hỗ trợ fintech/capacity (ADB Policy-Based Loans $2,4B target nhóm này); (f) GVC re-positioning từ assembly → mid-stream design/R&amp;D dựa trên 3 trụ cột Resilience + Environmental Sustainability + Inclusiveness. Cited §1.1 lớp 6 update + §5.3 Vietnam case study trong CĐ1 v3.9.)</w:t>
+        <w:t xml:space="preserve">stage; (d) Lạm phát dự phóng 4,0%; (e) Two-tier framing: FDI-sector 18% global solution contribution vs SMEs nội địa cần hỗ trợ fintech/capacity (ADB Policy-Based Loans $2,4B target nhóm này); (f) GVC re-positioning từ assembly thành mid-stream design/R&amp;D dựa trên 3 trụ cột Resilience + Environmental Sustainability + Inclusiveness. Cited Mục 1.1 lớp 6 update + Mục 5.3 Vietnam case study trong CĐ1 v3.9.)</w:t>
       </w:r>
     </w:p>
     <w:p>
@@ -3106,7 +3106,7 @@
           <w:iCs/>
           <w:i/>
         </w:rPr>
-        <w:t xml:space="preserve">(Mới v2.3 — GVC participation 9% → 18% 2000-2023.)</w:t>
+        <w:t xml:space="preserve">(Mới v2.3 — GVC participation 9% thành 18% 2000-2023.)</w:t>
       </w:r>
     </w:p>
     <w:p>
@@ -3358,7 +3358,7 @@
           <w:iCs/>
           <w:i/>
         </w:rPr>
-        <w:t xml:space="preserve">per §8.31; ước lượng 2023-2024. NCS verify trên trang IFC trước final. Cited §6 yếu tố giải thích trong CĐ1 v3.x — bổ sung framework 3 trụ cột cho ICRV interpretation.)</w:t>
+        <w:t xml:space="preserve">per Mục 8.31; ước lượng 2023-2024. NCS verify trên trang IFC trước final. Cited Mục 6 yếu tố giải thích trong CĐ1 v3.x — bổ sung framework 3 trụ cột cho ICRV interpretation.)</w:t>
       </w:r>
     </w:p>
     <w:p>
@@ -3640,13 +3640,13 @@
       </w:r>
     </w:p>
     <w:bookmarkEnd w:id="33"/>
-    <w:bookmarkStart w:id="34" w:name="X2132ca8004af576b93c55ebf0ffe37a44f46a17"/>
+    <w:bookmarkStart w:id="34" w:name="X1ca9aa89636ad43de36398867e3fda3073628b0"/>
     <w:p>
       <w:pPr>
         <w:pStyle w:val="Heading2"/>
       </w:pPr>
       <w:r>
-        <w:t xml:space="preserve">O. Văn bản pháp lý Việt Nam (cited trong CĐ1 §7.3.3)</w:t>
+        <w:t xml:space="preserve">O. Văn bản pháp lý Việt Nam (cited trong CĐ1 Mục 7.3.3)</w:t>
       </w:r>
     </w:p>
     <w:p>
@@ -3695,7 +3695,7 @@
           <w:iCs/>
           <w:i/>
         </w:rPr>
-        <w:t xml:space="preserve">(Mới v2.6 — Strait of Hormuz closure: 35% seaborne crude oil; Brent $72→$118/bbl March 2026; energy +24%; fertilizer +30%; EMDEs growth 3,6% downgrade 0,4pp; EMDE commodity exporters 2,4%.)</w:t>
+        <w:t xml:space="preserve">(Mới v2.6 — Strait of Hormuz closure: 35% seaborne crude oil; Brent $72 thành $118/bbl March 2026; energy +24%; fertilizer +30%; EMDEs growth 3,6% downgrade 0,4pp; EMDE commodity exporters 2,4%.)</w:t>
       </w:r>
     </w:p>
     <w:p>
@@ -3822,7 +3822,7 @@
           <w:iCs/>
           <w:i/>
         </w:rPr>
-        <w:t xml:space="preserve">(Mới v2.7 — progress slowest on record in 15 of 26 tracked development indicators; SIDS and Sub-Saharan Africa most affected; 75 years of development data: 121,249 data points · 107 datasets; per-capita income growth in LICs 2020-2025 below historical average; poorest quintile lost most ground since COVID-19 disruption.)</w:t>
+        <w:t xml:space="preserve">(Mới v2.7 — progress slowest on record in 15 of 26 tracked development indicators; SIDS and Sub-Saharan Africa most affected; 75 years of development data: 121,249 data points, 107 datasets; per-capita income growth in LICs 2020-2025 below historical average; poorest quintile lost most ground since COVID-19 disruption.)</w:t>
       </w:r>
     </w:p>
     <w:p>
@@ -5044,7 +5044,7 @@
           <w:iCs/>
           <w:i/>
         </w:rPr>
-        <w:t xml:space="preserve">(Mới v2.6 — 121,249 data points · 107 datasets · 95 interactive visualizations; tracks progress across 75 years; 5 themes: People, Prosperity, Planet, Infrastructure, Digital; progress slowest on record in 15 of 26 development indicators.)</w:t>
+        <w:t xml:space="preserve">(Mới v2.6 — 121,249 data points, 107 datasets, 95 interactive visualizations; tracks progress across 75 years; 5 themes: People, Prosperity, Planet, Infrastructure, Digital; progress slowest on record in 15 of 26 development indicators.)</w:t>
       </w:r>
     </w:p>
     <w:p>
@@ -5273,7 +5273,7 @@
           <w:iCs/>
           <w:i/>
         </w:rPr>
-        <w:t xml:space="preserve">(Cited in P5 §2 — trade re-equilibration, US-China tariff cycle, bilateral trade flow reorientation; Poverty and Equity Global Practice, October 2024.)</w:t>
+        <w:t xml:space="preserve">(Cited in P5 Mục 2 — trade re-equilibration, US-China tariff cycle, bilateral trade flow reorientation; Poverty and Equity Global Practice, October 2024.)</w:t>
       </w:r>
     </w:p>
     <w:p>
@@ -5564,7 +5564,7 @@
           <w:iCs/>
           <w:i/>
         </w:rPr>
-        <w:t xml:space="preserve">(Mới v2.9 — Vietnam DVAR tăng mạnh từ 2018: US demand shock 8,76% → DVAR +2,49 pp trong 2018-2020, giải thích 68,5% tổng tăng DVAR; firms phản ứng bằng cách xuất khẩu nhiều hơn sang cả US và non-US markets và ghi nhận tăng năng suất lao động; non-Chinese-owned firms là động lực chính; cơ chế: implicit rules of origin + FDI vào intermediates. Sử dụng matched firm-level + customs data 2016-2020. Cited P3 §5 Discussion — corroboration cho ascending-limb mechanism.)</w:t>
+        <w:t xml:space="preserve">(Mới v2.9 — Vietnam DVAR tăng mạnh từ 2018: US demand shock 8,76% thành DVAR +2,49 pp trong 2018-2020, giải thích 68,5% tổng tăng DVAR; firms phản ứng bằng cách xuất khẩu nhiều hơn sang cả US và non-US markets và ghi nhận tăng năng suất lao động; non-Chinese-owned firms là động lực chính; cơ chế: implicit rules of origin + FDI vào intermediates. Sử dụng matched firm-level + customs data 2016-2020. Cited P3 Mục 5 Discussion — corroboration cho ascending-limb mechanism.)</w:t>
       </w:r>
     </w:p>
     <w:p>
@@ -5598,7 +5598,7 @@
           <w:iCs/>
           <w:i/>
         </w:rPr>
-        <w:t xml:space="preserve">(Mới v2.9 — Vietnam: liberalization dịch vụ thương mại 2008-2016 → +2,9% năng suất hàng năm trong dịch vụ, +3,1% trong sản xuất;</w:t>
+        <w:t xml:space="preserve">(Mới v2.9 — Vietnam: liberalization dịch vụ thương mại 2008-2016 thành +2,9% năng suất hàng năm trong dịch vụ, +3,1% trong sản xuất;</w:t>
       </w:r>
       <w:r>
         <w:rPr>
@@ -5640,7 +5640,7 @@
           <w:iCs/>
           <w:i/>
         </w:rPr>
-        <w:t xml:space="preserve">strategy lợi ích hạn chế cho phần lớn đang phát triển; US Supreme Court Feb 20 2026 tuyên bố IEEPA tariffs unconstitutional. Cited P3 §5.5 Policy implications — macro-level corroboration cho tác động của mở cửa thương mại lên năng suất Việt Nam.)</w:t>
+        <w:t xml:space="preserve">strategy lợi ích hạn chế cho phần lớn đang phát triển; US Supreme Court Feb 20 2026 tuyên bố IEEPA tariffs unconstitutional. Cited P3 Mục 5.5 Policy implications — macro-level corroboration cho tác động của mở cửa thương mại lên năng suất Việt Nam.)</w:t>
       </w:r>
     </w:p>
     <w:p>
@@ -5674,7 +5674,7 @@
           <w:iCs/>
           <w:i/>
         </w:rPr>
-        <w:t xml:space="preserve">(Mới v2.9 — WBES-based; LICs mất gấp 2 lần thời gian và trả gấp 70 lần chi phí kết nối điện so với HICs; chất lượng điện → firm performance; phân tích 183 quốc gia. Cited P8 / CD1 — infrastructure quality như institutional void context cho SIDS.)</w:t>
+        <w:t xml:space="preserve">(Mới v2.9 — WBES-based; LICs mất gấp 2 lần thời gian và trả gấp 70 lần chi phí kết nối điện so với HICs; chất lượng điện thành firm performance; phân tích 183 quốc gia. Cited P8 / CD1 — infrastructure quality như institutional void context cho SIDS.)</w:t>
       </w:r>
     </w:p>
     <w:p>
@@ -5792,7 +5792,7 @@
           <w:iCs/>
           <w:i/>
         </w:rPr>
-        <w:t xml:space="preserve">trong môi trường năng lực thấp; tương quan dương vững giữa năng lực thể chế và phát triển kinh tế. Cited CD2 §3.3 Tầng 3 Institutional Theory — cung cấp định nghĩa và framework chính thức cho ICRV 6-regime classification.)</w:t>
+        <w:t xml:space="preserve">trong môi trường năng lực thấp; tương quan dương vững giữa năng lực thể chế và phát triển kinh tế. Cited CD2 Mục 3.3 Tầng 3 Institutional Theory — cung cấp định nghĩa và framework chính thức cho ICRV 6-regime classification.)</w:t>
       </w:r>
     </w:p>
     <w:p>
@@ -5926,7 +5926,7 @@
           <w:iCs/>
           <w:i/>
         </w:rPr>
-        <w:t xml:space="preserve">nếu trích dẫn cả hai. Cited P8 §1 Introduction — structural developmental constraints cho Pacific SIDS FIP mechanism.)</w:t>
+        <w:t xml:space="preserve">nếu trích dẫn cả hai. Cited P8 Mục 1 Introduction — structural developmental constraints cho Pacific SIDS FIP mechanism.)</w:t>
       </w:r>
     </w:p>
     <w:p>
@@ -6749,7 +6749,7 @@
         <w:pStyle w:val="Compact"/>
       </w:pPr>
       <w:r>
-        <w:t xml:space="preserve">Vietnam trade liberalization → productivity:</w:t>
+        <w:t xml:space="preserve">Vietnam trade liberalization thành productivity:</w:t>
       </w:r>
       <w:r>
         <w:t xml:space="preserve"> </w:t>
@@ -7120,7 +7120,7 @@
         <w:t xml:space="preserve">(pending)</w:t>
       </w:r>
       <w:r>
-        <w:t xml:space="preserve">: Citation trong file 16 §7.3.1 (3)(e) sectoral AI exposure cần verify trên trang BIS Working Papers. Có thể trong reference list của ADB ADO Special Topic April 2026 — NCS cần cross-check.</w:t>
+        <w:t xml:space="preserve">: Citation trong file 16 Mục 7.3.1 (3)(e) sectoral AI exposure cần verify trên trang BIS Working Papers. Có thể trong reference list của ADB ADO Special Topic April 2026 — NCS cần cross-check.</w:t>
       </w:r>
     </w:p>
     <w:p>
@@ -7145,7 +7145,7 @@
         <w:t xml:space="preserve">(pending)</w:t>
       </w:r>
       <w:r>
-        <w:t xml:space="preserve">: Citation trong file 16 §7.3.1 (3)(e) AI-enabling goods exports cần verify với specific publication name (e.g.,</w:t>
+        <w:t xml:space="preserve">: Citation trong file 16 Mục 7.3.1 (3)(e) AI-enabling goods exports cần verify với specific publication name (e.g.,</w:t>
       </w:r>
       <w:r>
         <w:t xml:space="preserve"> </w:t>

</xml_diff>

<commit_message>
build(ctu): align formatting to CTU Decision 1799/2021
- ctu_thesis_reference.docx: line spacing 1.5 -> 1.2 (per CTU spec) across
  styles; A4, Times New Roman 13pt, margins left 3cm/others 2cm already
  compliant.
- build_ctu_docx.sh PDF engine: A4, Liberation Serif (Times-metric) 13pt,
  margins left 3cm/right-top-bottom 2cm, line spacing 1.2 (scrartcl for 13pt).
- Rebuilt all 20 DOCX + 20 PDF deliverables.
Note: front-matter (cover, declaration, ToC, lists) and Roman/Arabic page
numbering are added at final dissertation assembly, not per content file.

https://claude.ai/code/session_01TNqoRFY1vAVQL6GWg8X9M3
</commit_message>
<xml_diff>
--- a/dist/downloads/04_references_apa7.docx
+++ b/dist/downloads/04_references_apa7.docx
@@ -11050,7 +11050,7 @@
     <w:name w:val="Normal"/>
     <w:qFormat/>
     <w:pPr>
-      <w:spacing w:line="360" w:lineRule="auto"/>
+      <w:spacing w:line="288" w:lineRule="auto"/>
       <w:jc w:val="both"/>
     </w:pPr>
     <w:rPr>
@@ -11064,7 +11064,7 @@
     <w:basedOn w:val="Normal"/>
     <w:link w:val="BodyTextChar"/>
     <w:pPr>
-      <w:spacing w:after="180" w:before="180" w:line="360" w:lineRule="auto"/>
+      <w:spacing w:after="180" w:before="180" w:line="288" w:lineRule="auto"/>
       <w:jc w:val="both"/>
     </w:pPr>
     <w:qFormat/>
@@ -11080,7 +11080,7 @@
     <w:next w:val="BodyText"/>
     <w:qFormat/>
     <w:pPr>
-      <w:spacing w:line="360" w:lineRule="auto"/>
+      <w:spacing w:line="288" w:lineRule="auto"/>
       <w:jc w:val="both"/>
     </w:pPr>
     <w:rPr>
@@ -11094,7 +11094,7 @@
     <w:basedOn w:val="BodyText"/>
     <w:qFormat/>
     <w:pPr>
-      <w:spacing w:after="36" w:before="36" w:line="360" w:lineRule="auto"/>
+      <w:spacing w:after="36" w:before="36" w:line="288" w:lineRule="auto"/>
       <w:jc w:val="both"/>
     </w:pPr>
     <w:rPr>
@@ -11111,7 +11111,7 @@
     <w:pPr>
       <w:keepNext/>
       <w:keepLines/>
-      <w:spacing w:after="240" w:before="480" w:line="360" w:lineRule="auto"/>
+      <w:spacing w:after="240" w:before="480" w:line="288" w:lineRule="auto"/>
       <w:jc w:val="both"/>
     </w:pPr>
     <w:rPr>
@@ -11131,7 +11131,7 @@
     <w:pPr>
       <w:keepNext/>
       <w:keepLines/>
-      <w:spacing w:after="240" w:before="240" w:line="360" w:lineRule="auto"/>
+      <w:spacing w:after="240" w:before="240" w:line="288" w:lineRule="auto"/>
       <w:jc w:val="both"/>
     </w:pPr>
     <w:rPr>
@@ -11148,7 +11148,7 @@
     <w:pPr>
       <w:keepNext/>
       <w:keepLines/>
-      <w:spacing w:line="360" w:lineRule="auto"/>
+      <w:spacing w:line="288" w:lineRule="auto"/>
       <w:jc w:val="both"/>
     </w:pPr>
     <w:rPr>
@@ -11164,7 +11164,7 @@
     <w:pPr>
       <w:keepNext/>
       <w:keepLines/>
-      <w:spacing w:line="360" w:lineRule="auto"/>
+      <w:spacing w:line="288" w:lineRule="auto"/>
       <w:jc w:val="both"/>
     </w:pPr>
     <w:rPr>
@@ -11182,7 +11182,7 @@
       <w:keepNext/>
       <w:keepLines/>
       <w:jc w:val="both"/>
-      <w:spacing w:after="0" w:before="300" w:line="360" w:lineRule="auto"/>
+      <w:spacing w:after="0" w:before="300" w:line="288" w:lineRule="auto"/>
     </w:pPr>
     <w:rPr>
       <w:color w:val="000000"/>
@@ -11200,7 +11200,7 @@
     <w:pPr>
       <w:keepNext/>
       <w:keepLines/>
-      <w:spacing w:after="300" w:before="100" w:line="360" w:lineRule="auto"/>
+      <w:spacing w:after="300" w:before="100" w:line="288" w:lineRule="auto"/>
       <w:jc w:val="both"/>
     </w:pPr>
     <w:rPr>
@@ -11216,7 +11216,7 @@
     <w:next w:val="Bibliography"/>
     <w:qFormat/>
     <w:pPr>
-      <w:spacing w:line="360" w:lineRule="auto"/>
+      <w:spacing w:line="288" w:lineRule="auto"/>
       <w:jc w:val="both"/>
     </w:pPr>
     <w:rPr>
@@ -11234,7 +11234,7 @@
     <w:pPr>
       <w:keepNext/>
       <w:keepLines/>
-      <w:spacing w:after="0" w:before="480" w:line="360" w:lineRule="auto"/>
+      <w:spacing w:after="0" w:before="480" w:line="288" w:lineRule="auto"/>
       <w:jc w:val="both"/>
       <w:outlineLvl w:val="0"/>
     </w:pPr>
@@ -11257,7 +11257,7 @@
     <w:pPr>
       <w:keepNext/>
       <w:keepLines/>
-      <w:spacing w:after="0" w:before="200" w:line="360" w:lineRule="auto"/>
+      <w:spacing w:after="0" w:before="200" w:line="288" w:lineRule="auto"/>
       <w:jc w:val="both"/>
       <w:outlineLvl w:val="1"/>
     </w:pPr>
@@ -11280,7 +11280,7 @@
     <w:pPr>
       <w:keepNext/>
       <w:keepLines/>
-      <w:spacing w:after="0" w:before="200" w:line="360" w:lineRule="auto"/>
+      <w:spacing w:after="0" w:before="200" w:line="288" w:lineRule="auto"/>
       <w:jc w:val="both"/>
       <w:outlineLvl w:val="2"/>
     </w:pPr>
@@ -11303,7 +11303,7 @@
     <w:pPr>
       <w:keepNext/>
       <w:keepLines/>
-      <w:spacing w:after="0" w:before="200" w:line="360" w:lineRule="auto"/>
+      <w:spacing w:after="0" w:before="200" w:line="288" w:lineRule="auto"/>
       <w:jc w:val="both"/>
       <w:outlineLvl w:val="3"/>
     </w:pPr>
@@ -11326,7 +11326,7 @@
     <w:pPr>
       <w:keepNext/>
       <w:keepLines/>
-      <w:spacing w:after="0" w:before="200" w:line="360" w:lineRule="auto"/>
+      <w:spacing w:after="0" w:before="200" w:line="288" w:lineRule="auto"/>
       <w:jc w:val="both"/>
       <w:outlineLvl w:val="4"/>
     </w:pPr>
@@ -11348,7 +11348,7 @@
     <w:pPr>
       <w:keepNext/>
       <w:keepLines/>
-      <w:spacing w:after="0" w:before="200" w:line="360" w:lineRule="auto"/>
+      <w:spacing w:after="0" w:before="200" w:line="288" w:lineRule="auto"/>
       <w:jc w:val="both"/>
       <w:outlineLvl w:val="5"/>
     </w:pPr>
@@ -11369,7 +11369,7 @@
     <w:pPr>
       <w:keepNext/>
       <w:keepLines/>
-      <w:spacing w:after="0" w:before="200" w:line="360" w:lineRule="auto"/>
+      <w:spacing w:after="0" w:before="200" w:line="288" w:lineRule="auto"/>
       <w:jc w:val="both"/>
       <w:outlineLvl w:val="6"/>
     </w:pPr>
@@ -11390,7 +11390,7 @@
     <w:pPr>
       <w:keepNext/>
       <w:keepLines/>
-      <w:spacing w:after="0" w:before="200" w:line="360" w:lineRule="auto"/>
+      <w:spacing w:after="0" w:before="200" w:line="288" w:lineRule="auto"/>
       <w:jc w:val="both"/>
       <w:outlineLvl w:val="7"/>
     </w:pPr>
@@ -11411,7 +11411,7 @@
     <w:pPr>
       <w:keepNext/>
       <w:keepLines/>
-      <w:spacing w:after="0" w:before="200" w:line="360" w:lineRule="auto"/>
+      <w:spacing w:after="0" w:before="200" w:line="288" w:lineRule="auto"/>
       <w:jc w:val="both"/>
       <w:outlineLvl w:val="8"/>
     </w:pPr>
@@ -11430,7 +11430,7 @@
     <w:unhideWhenUsed/>
     <w:qFormat/>
     <w:pPr>
-      <w:spacing w:after="100" w:before="100" w:line="360" w:lineRule="auto"/>
+      <w:spacing w:after="100" w:before="100" w:line="288" w:lineRule="auto"/>
       <w:ind w:firstLine="0" w:left="480" w:right="480"/>
       <w:jc w:val="both"/>
     </w:pPr>
@@ -11448,7 +11448,7 @@
     <w:unhideWhenUsed/>
     <w:qFormat/>
     <w:pPr>
-      <w:spacing w:line="360" w:lineRule="auto"/>
+      <w:spacing w:line="288" w:lineRule="auto"/>
       <w:jc w:val="both"/>
     </w:pPr>
     <w:rPr>
@@ -11474,7 +11474,7 @@
     <w:unhideWhenUsed/>
     <w:qFormat/>
     <w:pPr>
-      <w:spacing w:line="360" w:lineRule="auto"/>
+      <w:spacing w:line="288" w:lineRule="auto"/>
       <w:jc w:val="both"/>
     </w:pPr>
     <w:rPr>
@@ -11514,7 +11514,7 @@
     <w:pPr>
       <w:keepNext/>
       <w:keepLines/>
-      <w:spacing w:after="0" w:line="360" w:lineRule="auto"/>
+      <w:spacing w:after="0" w:line="288" w:lineRule="auto"/>
       <w:jc w:val="both"/>
     </w:pPr>
     <w:rPr>
@@ -11528,7 +11528,7 @@
     <w:name w:val="Definition"/>
     <w:basedOn w:val="Normal"/>
     <w:pPr>
-      <w:spacing w:line="360" w:lineRule="auto"/>
+      <w:spacing w:line="288" w:lineRule="auto"/>
       <w:jc w:val="both"/>
     </w:pPr>
     <w:rPr>
@@ -11542,7 +11542,7 @@
     <w:basedOn w:val="Normal"/>
     <w:link w:val="BodyTextChar"/>
     <w:pPr>
-      <w:spacing w:after="120" w:before="0" w:line="360" w:lineRule="auto"/>
+      <w:spacing w:after="120" w:before="0" w:line="288" w:lineRule="auto"/>
       <w:jc w:val="both"/>
     </w:pPr>
     <w:rPr>
@@ -11557,7 +11557,7 @@
     <w:basedOn w:val="Caption"/>
     <w:pPr>
       <w:keepNext/>
-      <w:spacing w:line="360" w:lineRule="auto"/>
+      <w:spacing w:line="288" w:lineRule="auto"/>
       <w:jc w:val="both"/>
     </w:pPr>
     <w:rPr>
@@ -11570,7 +11570,7 @@
     <w:name w:val="Image Caption"/>
     <w:basedOn w:val="Caption"/>
     <w:pPr>
-      <w:spacing w:line="360" w:lineRule="auto"/>
+      <w:spacing w:line="288" w:lineRule="auto"/>
       <w:jc w:val="both"/>
     </w:pPr>
     <w:rPr>
@@ -11583,7 +11583,7 @@
     <w:name w:val="Figure"/>
     <w:basedOn w:val="Normal"/>
     <w:pPr>
-      <w:spacing w:line="360" w:lineRule="auto"/>
+      <w:spacing w:line="288" w:lineRule="auto"/>
       <w:jc w:val="both"/>
     </w:pPr>
     <w:rPr>
@@ -11597,7 +11597,7 @@
     <w:basedOn w:val="Figure"/>
     <w:pPr>
       <w:keepNext/>
-      <w:spacing w:line="360" w:lineRule="auto"/>
+      <w:spacing w:line="288" w:lineRule="auto"/>
       <w:jc w:val="both"/>
     </w:pPr>
     <w:rPr>
@@ -11661,7 +11661,7 @@
     <w:unhideWhenUsed/>
     <w:qFormat/>
     <w:pPr>
-      <w:spacing w:before="240" w:line="360" w:lineRule="auto"/>
+      <w:spacing w:before="240" w:line="288" w:lineRule="auto"/>
       <w:jc w:val="both"/>
       <w:outlineLvl w:val="9"/>
     </w:pPr>

</xml_diff>

<commit_message>
build(deliverables): rebuild DOCX/PDF with P4 TP=82%, clean Ch3, Uppsala update
Regenerate all chapter/CD/manuscript/reference DOCX+PDF, reassemble
LUAN_AN_FULL_vi.docx, and build A5 TOM_TAT_LUAN_AN_vi.docx from the
corrected sources. Verified: 0 stray 88.6 in dissertation/P4 outputs;
P4 turning point reads ~82% throughout.

https://claude.ai/code/session_01TNqoRFY1vAVQL6GWg8X9M3
</commit_message>
<xml_diff>
--- a/dist/downloads/04_references_apa7.docx
+++ b/dist/downloads/04_references_apa7.docx
@@ -8781,6 +8781,27 @@
         <w:pStyle w:val="BodyText"/>
       </w:pPr>
       <w:r>
+        <w:t xml:space="preserve">Coviello, N., Kano, L., &amp; Liesch, P. W. (2017). Adapting the Uppsala model to a modern world: Macro-context and microfoundations.</w:t>
+      </w:r>
+      <w:r>
+        <w:t xml:space="preserve"> </w:t>
+      </w:r>
+      <w:r>
+        <w:rPr>
+          <w:iCs/>
+          <w:i/>
+        </w:rPr>
+        <w:t xml:space="preserve">Journal of International Business Studies, 48</w:t>
+      </w:r>
+      <w:r>
+        <w:t xml:space="preserve">(9), 1151-1164. https://doi.org/10.1057/s41267-017-0120-x</w:t>
+      </w:r>
+    </w:p>
+    <w:p>
+      <w:pPr>
+        <w:pStyle w:val="BodyText"/>
+      </w:pPr>
+      <w:r>
         <w:t xml:space="preserve">Cuervo-Cazurra, A., Ciravegna, L., Melgarejo, M., &amp; Lopez, L. (2017). Home country uncertainty and the internationalization-performance relationship: Building an uncertainty management capability.</w:t>
       </w:r>
       <w:r>
@@ -9542,6 +9563,27 @@
       </w:r>
       <w:r>
         <w:t xml:space="preserve">(2), 239-250. https://doi.org/10.1002/gsj.1383</w:t>
+      </w:r>
+    </w:p>
+    <w:p>
+      <w:pPr>
+        <w:pStyle w:val="BodyText"/>
+      </w:pPr>
+      <w:r>
+        <w:t xml:space="preserve">Vahlne, J.-E., &amp; Johanson, J. (2017). From internationalization to evolution: The Uppsala model at 40 years.</w:t>
+      </w:r>
+      <w:r>
+        <w:t xml:space="preserve"> </w:t>
+      </w:r>
+      <w:r>
+        <w:rPr>
+          <w:iCs/>
+          <w:i/>
+        </w:rPr>
+        <w:t xml:space="preserve">Journal of International Business Studies, 48</w:t>
+      </w:r>
+      <w:r>
+        <w:t xml:space="preserve">(9), 1087-1102. https://doi.org/10.1057/s41267-017-0107-7</w:t>
       </w:r>
     </w:p>
     <w:bookmarkEnd w:id="46"/>

</xml_diff>